<commit_message>
feat(prediction_study): TRIPOD+AI gap-closers + tool sampling sensitivity
Next-1 (TRIPOD+AI items 8/14/AI-3): model_audit.py emits per-model standardized coefficients
(item 14), events-per-variable (item 8: EPV 1,254-2,123, far above >=10-20), and sex/age subgroup
performance (AI-3). New finding: discrimination is lower in patients >=65 (HF 0.85 vs 0.93 <65) --
added as manuscript section 3.9 (Table 5) + limitation 7; checklist items 8/14/AI-3 now closed.

Next-3 (accessibility, safe core): identify_eval.py gains balanced subsampling; the harness on the
tool's identical 800/1600 sample gives AUROC 0.902 ~= full-cohort 0.907 ~= tool 0.914, proving the
plugin's balanced sampling does not inflate discrimination (rules out the apples-to-oranges
artefact without touching the live DB). Folded into section 3.6 + the capability map.

Manuscript + checklist + .docx regenerated.

Co-Authored-By: Claude Opus 4.8 <noreply@anthropic.com>
</commit_message>
<xml_diff>
--- a/paper/PREDICTION_MANUSCRIPT.docx
+++ b/paper/PREDICTION_MANUSCRIPT.docx
@@ -222,7 +222,7 @@
         <w:t xml:space="preserve"> </w:t>
       </w:r>
       <w:r>
-        <w:t xml:space="preserve">decision-curve analysis (DCA), and benchmarked discrimination against models built</w:t>
+        <w:t xml:space="preserve">decision-curve analysis (DCA), reported sex/age subgroup performance, and benchmarked discrimination against models built</w:t>
       </w:r>
       <w:r>
         <w:t xml:space="preserve"> </w:t>
@@ -1348,7 +1348,46 @@
         <w:t xml:space="preserve"> </w:t>
       </w:r>
       <w:r>
-        <w:t xml:space="preserve">hold-out.</w:t>
+        <w:t xml:space="preserve">hold-out. The models are richly powered: the development sets held 56,428 (HF), 58,002 (CKD), and</w:t>
+      </w:r>
+      <w:r>
+        <w:t xml:space="preserve"> </w:t>
+      </w:r>
+      <w:r>
+        <w:t xml:space="preserve">93,415 (diabetes) events against 44–45 candidate predictors — an events-per-variable of 1,254–2,123,</w:t>
+      </w:r>
+      <w:r>
+        <w:t xml:space="preserve"> </w:t>
+      </w:r>
+      <w:r>
+        <w:t xml:space="preserve">far above the conventional ≥10–20 threshold, so overfitting is not a concern. Per-model standardized</w:t>
+      </w:r>
+      <w:r>
+        <w:t xml:space="preserve"> </w:t>
+      </w:r>
+      <w:r>
+        <w:t xml:space="preserve">coefficients (odds ratios) are provided as a supplement (</w:t>
+      </w:r>
+      <w:r>
+        <w:rPr>
+          <w:rStyle w:val="VerbatimChar"/>
+        </w:rPr>
+        <w:t xml:space="preserve">results/model_spec_&lt;phenotype&gt;.md</w:t>
+      </w:r>
+      <w:r>
+        <w:t xml:space="preserve">).</w:t>
+      </w:r>
+      <w:r>
+        <w:t xml:space="preserve"> </w:t>
+      </w:r>
+      <w:r>
+        <w:t xml:space="preserve">We additionally report performance within prespecified subgroups (sex; age &lt;65 vs ≥65) as a</w:t>
+      </w:r>
+      <w:r>
+        <w:t xml:space="preserve"> </w:t>
+      </w:r>
+      <w:r>
+        <w:t xml:space="preserve">fairness assessment (§3.9).</w:t>
       </w:r>
     </w:p>
     <w:bookmarkEnd w:id="15"/>
@@ -1797,7 +1836,7 @@
     </w:p>
     <w:bookmarkEnd w:id="20"/>
     <w:bookmarkEnd w:id="21"/>
-    <w:bookmarkStart w:id="30" w:name="results"/>
+    <w:bookmarkStart w:id="31" w:name="results"/>
     <w:p>
       <w:pPr>
         <w:pStyle w:val="Heading2"/>
@@ -2995,13 +3034,19 @@
         <w:t xml:space="preserve"> </w:t>
       </w:r>
       <w:r>
-        <w:t xml:space="preserve">builds use the plugin’s balanced sampling (n=2,400, 1:2), which is why its numbers run marginally</w:t>
-      </w:r>
-      <w:r>
-        <w:t xml:space="preserve"> </w:t>
-      </w:r>
-      <w:r>
-        <w:t xml:space="preserve">higher; the central point stands —</w:t>
+        <w:t xml:space="preserve">builds use the plugin’s balanced sampling (n=2,400, 800 positive / 1,600 negative). To confirm</w:t>
+      </w:r>
+      <w:r>
+        <w:t xml:space="preserve"> </w:t>
+      </w:r>
+      <w:r>
+        <w:t xml:space="preserve">that this sampling — not a genuinely different model — explains the tool’s marginally higher</w:t>
+      </w:r>
+      <w:r>
+        <w:t xml:space="preserve"> </w:t>
+      </w:r>
+      <w:r>
+        <w:t xml:space="preserve">numbers, we trained the harness on an</w:t>
       </w:r>
       <w:r>
         <w:t xml:space="preserve"> </w:t>
@@ -3011,21 +3056,48 @@
           <w:i/>
           <w:iCs/>
         </w:rPr>
-        <w:t xml:space="preserve">a non-ML researcher driving the tool reproduces the modelling</w:t>
+        <w:t xml:space="preserve">identical</w:t>
+      </w:r>
+      <w:r>
+        <w:t xml:space="preserve"> </w:t>
+      </w:r>
+      <w:r>
+        <w:t xml:space="preserve">800/1,600 balanced HF sample and obtained ROC</w:t>
+      </w:r>
+      <w:r>
+        <w:t xml:space="preserve"> </w:t>
+      </w:r>
+      <w:r>
+        <w:t xml:space="preserve">AUC</w:t>
+      </w:r>
+      <w:r>
+        <w:t xml:space="preserve"> </w:t>
+      </w:r>
+      <w:r>
+        <w:rPr>
+          <w:b/>
+          <w:bCs/>
+        </w:rPr>
+        <w:t xml:space="preserve">0.902</w:t>
+      </w:r>
+      <w:r>
+        <w:t xml:space="preserve">, essentially equal to the full natural-prevalence 0.907 and the tool’s 0.914. The</w:t>
+      </w:r>
+      <w:r>
+        <w:t xml:space="preserve"> </w:t>
+      </w:r>
+      <w:r>
+        <w:t xml:space="preserve">balanced sampling therefore does not inflate discrimination, and the central point stands —</w:t>
+      </w:r>
+      <w:r>
+        <w:t xml:space="preserve"> </w:t>
       </w:r>
       <w:r>
         <w:rPr>
           <w:i/>
           <w:iCs/>
         </w:rPr>
-        <w:t xml:space="preserve"> </w:t>
-      </w:r>
-      <w:r>
-        <w:rPr>
-          <w:i/>
-          <w:iCs/>
-        </w:rPr>
-        <w:t xml:space="preserve">result</w:t>
+        <w:t xml:space="preserve">a non-ML researcher driving the tool reproduces the modelling result</w:t>
       </w:r>
       <w:r>
         <w:t xml:space="preserve">. The supplementary capability map details the division of labour: the tool fits and serves</w:t>
@@ -3326,8 +3398,364 @@
       </w:r>
     </w:p>
     <w:bookmarkEnd w:id="29"/>
+    <w:bookmarkStart w:id="30" w:name="subgroup-performance-fairness"/>
+    <w:p>
+      <w:pPr>
+        <w:pStyle w:val="Heading3"/>
+      </w:pPr>
+      <w:r>
+        <w:t xml:space="preserve">3.9 Subgroup performance (fairness)</w:t>
+      </w:r>
+    </w:p>
+    <w:p>
+      <w:pPr>
+        <w:pStyle w:val="FirstParagraph"/>
+      </w:pPr>
+      <w:r>
+        <w:t xml:space="preserve">Discrimination and calibration within prespecified subgroups (Table 5) were stable across sex but</w:t>
+      </w:r>
+      <w:r>
+        <w:t xml:space="preserve"> </w:t>
+      </w:r>
+      <w:r>
+        <w:rPr>
+          <w:b/>
+          <w:bCs/>
+        </w:rPr>
+        <w:t xml:space="preserve">lower in older patients</w:t>
+      </w:r>
+      <w:r>
+        <w:t xml:space="preserve"> </w:t>
+      </w:r>
+      <w:r>
+        <w:t xml:space="preserve">for the cardiorenal phenotypes:</w:t>
+      </w:r>
+    </w:p>
+    <w:tbl>
+      <w:tblPr>
+        <w:tblStyle w:val="Table"/>
+        <w:tblW w:type="auto" w:w="0"/>
+        <w:tblLook w:firstRow="1" w:lastRow="0" w:firstColumn="0" w:lastColumn="0" w:noHBand="0" w:noVBand="0" w:val="0020"/>
+      </w:tblPr>
+      <w:tblGrid>
+        <w:gridCol w:w="1320"/>
+        <w:gridCol w:w="1320"/>
+        <w:gridCol w:w="1320"/>
+        <w:gridCol w:w="1320"/>
+        <w:gridCol w:w="1320"/>
+        <w:gridCol w:w="1320"/>
+      </w:tblGrid>
+      <w:tr>
+        <w:trPr>
+          <w:tblHeader w:val="on"/>
+        </w:trPr>
+        <w:tc>
+          <w:tcPr/>
+          <w:p>
+            <w:pPr>
+              <w:pStyle w:val="Compact"/>
+            </w:pPr>
+            <w:r>
+              <w:t xml:space="preserve">Phenotype</w:t>
+            </w:r>
+          </w:p>
+        </w:tc>
+        <w:tc>
+          <w:tcPr/>
+          <w:p>
+            <w:pPr>
+              <w:pStyle w:val="Compact"/>
+            </w:pPr>
+            <w:r>
+              <w:t xml:space="preserve">Female</w:t>
+            </w:r>
+          </w:p>
+        </w:tc>
+        <w:tc>
+          <w:tcPr/>
+          <w:p>
+            <w:pPr>
+              <w:pStyle w:val="Compact"/>
+            </w:pPr>
+            <w:r>
+              <w:t xml:space="preserve">Male</w:t>
+            </w:r>
+          </w:p>
+        </w:tc>
+        <w:tc>
+          <w:tcPr/>
+          <w:p>
+            <w:pPr>
+              <w:pStyle w:val="Compact"/>
+            </w:pPr>
+            <w:r>
+              <w:t xml:space="preserve">Age &lt;65</w:t>
+            </w:r>
+          </w:p>
+        </w:tc>
+        <w:tc>
+          <w:tcPr/>
+          <w:p>
+            <w:pPr>
+              <w:pStyle w:val="Compact"/>
+            </w:pPr>
+            <w:r>
+              <w:t xml:space="preserve">Age ≥65</w:t>
+            </w:r>
+          </w:p>
+        </w:tc>
+        <w:tc>
+          <w:tcPr/>
+          <w:p>
+            <w:pPr>
+              <w:pStyle w:val="Compact"/>
+            </w:pPr>
+            <w:r>
+              <w:t xml:space="preserve">Largest gap</w:t>
+            </w:r>
+          </w:p>
+        </w:tc>
+      </w:tr>
+      <w:tr>
+        <w:tc>
+          <w:tcPr/>
+          <w:p>
+            <w:pPr>
+              <w:pStyle w:val="Compact"/>
+            </w:pPr>
+            <w:r>
+              <w:t xml:space="preserve">Heart failure</w:t>
+            </w:r>
+          </w:p>
+        </w:tc>
+        <w:tc>
+          <w:tcPr/>
+          <w:p>
+            <w:pPr>
+              <w:pStyle w:val="Compact"/>
+            </w:pPr>
+            <w:r>
+              <w:t xml:space="preserve">0.915</w:t>
+            </w:r>
+          </w:p>
+        </w:tc>
+        <w:tc>
+          <w:tcPr/>
+          <w:p>
+            <w:pPr>
+              <w:pStyle w:val="Compact"/>
+            </w:pPr>
+            <w:r>
+              <w:t xml:space="preserve">0.898</w:t>
+            </w:r>
+          </w:p>
+        </w:tc>
+        <w:tc>
+          <w:tcPr/>
+          <w:p>
+            <w:pPr>
+              <w:pStyle w:val="Compact"/>
+            </w:pPr>
+            <w:r>
+              <w:t xml:space="preserve">0.928</w:t>
+            </w:r>
+          </w:p>
+        </w:tc>
+        <w:tc>
+          <w:tcPr/>
+          <w:p>
+            <w:pPr>
+              <w:pStyle w:val="Compact"/>
+            </w:pPr>
+            <w:r>
+              <w:t xml:space="preserve">0.848</w:t>
+            </w:r>
+          </w:p>
+        </w:tc>
+        <w:tc>
+          <w:tcPr/>
+          <w:p>
+            <w:pPr>
+              <w:pStyle w:val="Compact"/>
+            </w:pPr>
+            <w:r>
+              <w:t xml:space="preserve">0.079</w:t>
+            </w:r>
+          </w:p>
+        </w:tc>
+      </w:tr>
+      <w:tr>
+        <w:tc>
+          <w:tcPr/>
+          <w:p>
+            <w:pPr>
+              <w:pStyle w:val="Compact"/>
+            </w:pPr>
+            <w:r>
+              <w:t xml:space="preserve">Chronic kidney disease</w:t>
+            </w:r>
+          </w:p>
+        </w:tc>
+        <w:tc>
+          <w:tcPr/>
+          <w:p>
+            <w:pPr>
+              <w:pStyle w:val="Compact"/>
+            </w:pPr>
+            <w:r>
+              <w:t xml:space="preserve">0.939</w:t>
+            </w:r>
+          </w:p>
+        </w:tc>
+        <w:tc>
+          <w:tcPr/>
+          <w:p>
+            <w:pPr>
+              <w:pStyle w:val="Compact"/>
+            </w:pPr>
+            <w:r>
+              <w:t xml:space="preserve">0.928</w:t>
+            </w:r>
+          </w:p>
+        </w:tc>
+        <w:tc>
+          <w:tcPr/>
+          <w:p>
+            <w:pPr>
+              <w:pStyle w:val="Compact"/>
+            </w:pPr>
+            <w:r>
+              <w:t xml:space="preserve">0.956</w:t>
+            </w:r>
+          </w:p>
+        </w:tc>
+        <w:tc>
+          <w:tcPr/>
+          <w:p>
+            <w:pPr>
+              <w:pStyle w:val="Compact"/>
+            </w:pPr>
+            <w:r>
+              <w:t xml:space="preserve">0.888</w:t>
+            </w:r>
+          </w:p>
+        </w:tc>
+        <w:tc>
+          <w:tcPr/>
+          <w:p>
+            <w:pPr>
+              <w:pStyle w:val="Compact"/>
+            </w:pPr>
+            <w:r>
+              <w:t xml:space="preserve">0.068</w:t>
+            </w:r>
+          </w:p>
+        </w:tc>
+      </w:tr>
+      <w:tr>
+        <w:tc>
+          <w:tcPr/>
+          <w:p>
+            <w:pPr>
+              <w:pStyle w:val="Compact"/>
+            </w:pPr>
+            <w:r>
+              <w:t xml:space="preserve">Diabetes</w:t>
+            </w:r>
+          </w:p>
+        </w:tc>
+        <w:tc>
+          <w:tcPr/>
+          <w:p>
+            <w:pPr>
+              <w:pStyle w:val="Compact"/>
+            </w:pPr>
+            <w:r>
+              <w:t xml:space="preserve">0.935</w:t>
+            </w:r>
+          </w:p>
+        </w:tc>
+        <w:tc>
+          <w:tcPr/>
+          <w:p>
+            <w:pPr>
+              <w:pStyle w:val="Compact"/>
+            </w:pPr>
+            <w:r>
+              <w:t xml:space="preserve">0.930</w:t>
+            </w:r>
+          </w:p>
+        </w:tc>
+        <w:tc>
+          <w:tcPr/>
+          <w:p>
+            <w:pPr>
+              <w:pStyle w:val="Compact"/>
+            </w:pPr>
+            <w:r>
+              <w:t xml:space="preserve">0.944</w:t>
+            </w:r>
+          </w:p>
+        </w:tc>
+        <w:tc>
+          <w:tcPr/>
+          <w:p>
+            <w:pPr>
+              <w:pStyle w:val="Compact"/>
+            </w:pPr>
+            <w:r>
+              <w:t xml:space="preserve">0.910</w:t>
+            </w:r>
+          </w:p>
+        </w:tc>
+        <w:tc>
+          <w:tcPr/>
+          <w:p>
+            <w:pPr>
+              <w:pStyle w:val="Compact"/>
+            </w:pPr>
+            <w:r>
+              <w:t xml:space="preserve">0.034</w:t>
+            </w:r>
+          </w:p>
+        </w:tc>
+      </w:tr>
+    </w:tbl>
+    <w:p>
+      <w:pPr>
+        <w:pStyle w:val="BodyText"/>
+      </w:pPr>
+      <w:r>
+        <w:t xml:space="preserve">Calibration slope stayed near 1.0 in every subgroup. The age gap is expected and clinically</w:t>
+      </w:r>
+      <w:r>
+        <w:t xml:space="preserve"> </w:t>
+      </w:r>
+      <w:r>
+        <w:t xml:space="preserve">interpretable: in patients ≥65 the phenotypes are both more prevalent (HF 26% vs 8%) and more</w:t>
+      </w:r>
+      <w:r>
+        <w:t xml:space="preserve"> </w:t>
+      </w:r>
+      <w:r>
+        <w:t xml:space="preserve">diffuse — comorbidity and polypharmacy compress the feature contrast between cases and non-cases —</w:t>
+      </w:r>
+      <w:r>
+        <w:t xml:space="preserve"> </w:t>
+      </w:r>
+      <w:r>
+        <w:t xml:space="preserve">so the headline AUROC is partly buoyed by sharper separation in younger patients. We report this</w:t>
+      </w:r>
+      <w:r>
+        <w:t xml:space="preserve"> </w:t>
+      </w:r>
+      <w:r>
+        <w:t xml:space="preserve">transparently rather than only the pooled number; it is a target for age-stratified modelling (§5).</w:t>
+      </w:r>
+    </w:p>
     <w:bookmarkEnd w:id="30"/>
-    <w:bookmarkStart w:id="31" w:name="discussion"/>
+    <w:bookmarkEnd w:id="31"/>
+    <w:bookmarkStart w:id="32" w:name="discussion"/>
     <w:p>
       <w:pPr>
         <w:pStyle w:val="Heading2"/>
@@ -3568,8 +3996,8 @@
         <w:t xml:space="preserve">TRIPOD+AI and PROBAST require and that single-center model papers commonly omit.</w:t>
       </w:r>
     </w:p>
-    <w:bookmarkEnd w:id="31"/>
-    <w:bookmarkStart w:id="32" w:name="limitations"/>
+    <w:bookmarkEnd w:id="32"/>
+    <w:bookmarkStart w:id="33" w:name="limitations"/>
     <w:p>
       <w:pPr>
         <w:pStyle w:val="Heading2"/>
@@ -3813,8 +4241,42 @@
         <w:t xml:space="preserve">modelling.</w:t>
       </w:r>
     </w:p>
-    <w:bookmarkEnd w:id="32"/>
-    <w:bookmarkStart w:id="33" w:name="conclusion"/>
+    <w:p>
+      <w:pPr>
+        <w:pStyle w:val="Compact"/>
+        <w:numPr>
+          <w:ilvl w:val="0"/>
+          <w:numId w:val="1002"/>
+        </w:numPr>
+      </w:pPr>
+      <w:r>
+        <w:rPr>
+          <w:b/>
+          <w:bCs/>
+        </w:rPr>
+        <w:t xml:space="preserve">Age-dependent discrimination.</w:t>
+      </w:r>
+      <w:r>
+        <w:t xml:space="preserve"> </w:t>
+      </w:r>
+      <w:r>
+        <w:t xml:space="preserve">Performance is lower in patients ≥65 (HF AUROC 0.85 vs 0.93</w:t>
+      </w:r>
+      <w:r>
+        <w:t xml:space="preserve"> </w:t>
+      </w:r>
+      <w:r>
+        <w:t xml:space="preserve">under 65; §3.9). The pooled estimate is partly buoyed by younger patients; age-stratified or</w:t>
+      </w:r>
+      <w:r>
+        <w:t xml:space="preserve"> </w:t>
+      </w:r>
+      <w:r>
+        <w:t xml:space="preserve">age-interaction models are a natural extension.</w:t>
+      </w:r>
+    </w:p>
+    <w:bookmarkEnd w:id="33"/>
+    <w:bookmarkStart w:id="34" w:name="conclusion"/>
     <w:p>
       <w:pPr>
         <w:pStyle w:val="Heading2"/>
@@ -3867,8 +4329,8 @@
         <w:t xml:space="preserve">modelling.</w:t>
       </w:r>
     </w:p>
-    <w:bookmarkEnd w:id="33"/>
-    <w:bookmarkStart w:id="34" w:name="data-and-code-availability"/>
+    <w:bookmarkEnd w:id="34"/>
+    <w:bookmarkStart w:id="35" w:name="data-and-code-availability"/>
     <w:p>
       <w:pPr>
         <w:pStyle w:val="Heading2"/>
@@ -4011,8 +4473,8 @@
         <w:t xml:space="preserve">.</w:t>
       </w:r>
     </w:p>
-    <w:bookmarkEnd w:id="34"/>
-    <w:bookmarkStart w:id="35" w:name="tables-and-figures"/>
+    <w:bookmarkEnd w:id="35"/>
+    <w:bookmarkStart w:id="36" w:name="tables-and-figures"/>
     <w:p>
       <w:pPr>
         <w:pStyle w:val="Heading2"/>
@@ -4149,34 +4611,31 @@
           <w:b/>
           <w:bCs/>
         </w:rPr>
-        <w:t xml:space="preserve">Figure 1</w:t>
-      </w:r>
-      <w:r>
-        <w:t xml:space="preserve"> </w:t>
-      </w:r>
-      <w:r>
-        <w:t xml:space="preserve">— external validation summary (</w:t>
+        <w:t xml:space="preserve">Table 5</w:t>
+      </w:r>
+      <w:r>
+        <w:t xml:space="preserve"> </w:t>
+      </w:r>
+      <w:r>
+        <w:t xml:space="preserve">— subgroup performance by sex and age (</w:t>
       </w:r>
       <w:r>
         <w:rPr>
           <w:rStyle w:val="VerbatimChar"/>
         </w:rPr>
-        <w:t xml:space="preserve">results/external_validation_summary.png</w:t>
-      </w:r>
-      <w:r>
-        <w:t xml:space="preserve">);</w:t>
-      </w:r>
-      <w:r>
-        <w:t xml:space="preserve"> </w:t>
-      </w:r>
-      <w:r>
-        <w:t xml:space="preserve">per-condition calibration (</w:t>
+        <w:t xml:space="preserve">results/model_audit_summary.md</w:t>
+      </w:r>
+      <w:r>
+        <w:t xml:space="preserve">,</w:t>
+      </w:r>
+      <w:r>
+        <w:t xml:space="preserve"> </w:t>
       </w:r>
       <w:r>
         <w:rPr>
           <w:rStyle w:val="VerbatimChar"/>
         </w:rPr>
-        <w:t xml:space="preserve">results/{hf,ckd,dm}_external_calibration.png</w:t>
+        <w:t xml:space="preserve">results/fairness_{hf,ckd,dm}.md</w:t>
       </w:r>
       <w:r>
         <w:t xml:space="preserve">).</w:t>
@@ -4195,19 +4654,34 @@
           <w:b/>
           <w:bCs/>
         </w:rPr>
-        <w:t xml:space="preserve">Figures 2a–c</w:t>
-      </w:r>
-      <w:r>
-        <w:t xml:space="preserve"> </w:t>
-      </w:r>
-      <w:r>
-        <w:t xml:space="preserve">— leakage decay (</w:t>
+        <w:t xml:space="preserve">Figure 1</w:t>
+      </w:r>
+      <w:r>
+        <w:t xml:space="preserve"> </w:t>
+      </w:r>
+      <w:r>
+        <w:t xml:space="preserve">— external validation summary (</w:t>
       </w:r>
       <w:r>
         <w:rPr>
           <w:rStyle w:val="VerbatimChar"/>
         </w:rPr>
-        <w:t xml:space="preserve">results/{hf,ckd,dm}_decay.png</w:t>
+        <w:t xml:space="preserve">results/external_validation_summary.png</w:t>
+      </w:r>
+      <w:r>
+        <w:t xml:space="preserve">);</w:t>
+      </w:r>
+      <w:r>
+        <w:t xml:space="preserve"> </w:t>
+      </w:r>
+      <w:r>
+        <w:t xml:space="preserve">per-condition calibration (</w:t>
+      </w:r>
+      <w:r>
+        <w:rPr>
+          <w:rStyle w:val="VerbatimChar"/>
+        </w:rPr>
+        <w:t xml:space="preserve">results/{hf,ckd,dm}_external_calibration.png</w:t>
       </w:r>
       <w:r>
         <w:t xml:space="preserve">).</w:t>
@@ -4226,44 +4700,19 @@
           <w:b/>
           <w:bCs/>
         </w:rPr>
-        <w:t xml:space="preserve">Figures 3a–c</w:t>
-      </w:r>
-      <w:r>
-        <w:t xml:space="preserve"> </w:t>
-      </w:r>
-      <w:r>
-        <w:t xml:space="preserve">— decision curves (</w:t>
+        <w:t xml:space="preserve">Figures 2a–c</w:t>
+      </w:r>
+      <w:r>
+        <w:t xml:space="preserve"> </w:t>
+      </w:r>
+      <w:r>
+        <w:t xml:space="preserve">— leakage decay (</w:t>
       </w:r>
       <w:r>
         <w:rPr>
           <w:rStyle w:val="VerbatimChar"/>
         </w:rPr>
-        <w:t xml:space="preserve">results/{hf,ckd,dm}_dca.png</w:t>
-      </w:r>
-      <w:r>
-        <w:t xml:space="preserve">);</w:t>
-      </w:r>
-      <w:r>
-        <w:t xml:space="preserve"> </w:t>
-      </w:r>
-      <w:r>
-        <w:rPr>
-          <w:b/>
-          <w:bCs/>
-        </w:rPr>
-        <w:t xml:space="preserve">Figure 3d</w:t>
-      </w:r>
-      <w:r>
-        <w:t xml:space="preserve"> </w:t>
-      </w:r>
-      <w:r>
-        <w:t xml:space="preserve">— full vs guideline-variable reference comparator (</w:t>
-      </w:r>
-      <w:r>
-        <w:rPr>
-          <w:rStyle w:val="VerbatimChar"/>
-        </w:rPr>
-        <w:t xml:space="preserve">results/hf_reference_dca.png</w:t>
+        <w:t xml:space="preserve">results/{hf,ckd,dm}_decay.png</w:t>
       </w:r>
       <w:r>
         <w:t xml:space="preserve">).</w:t>
@@ -4282,6 +4731,62 @@
           <w:b/>
           <w:bCs/>
         </w:rPr>
+        <w:t xml:space="preserve">Figures 3a–c</w:t>
+      </w:r>
+      <w:r>
+        <w:t xml:space="preserve"> </w:t>
+      </w:r>
+      <w:r>
+        <w:t xml:space="preserve">— decision curves (</w:t>
+      </w:r>
+      <w:r>
+        <w:rPr>
+          <w:rStyle w:val="VerbatimChar"/>
+        </w:rPr>
+        <w:t xml:space="preserve">results/{hf,ckd,dm}_dca.png</w:t>
+      </w:r>
+      <w:r>
+        <w:t xml:space="preserve">);</w:t>
+      </w:r>
+      <w:r>
+        <w:t xml:space="preserve"> </w:t>
+      </w:r>
+      <w:r>
+        <w:rPr>
+          <w:b/>
+          <w:bCs/>
+        </w:rPr>
+        <w:t xml:space="preserve">Figure 3d</w:t>
+      </w:r>
+      <w:r>
+        <w:t xml:space="preserve"> </w:t>
+      </w:r>
+      <w:r>
+        <w:t xml:space="preserve">— full vs guideline-variable reference comparator (</w:t>
+      </w:r>
+      <w:r>
+        <w:rPr>
+          <w:rStyle w:val="VerbatimChar"/>
+        </w:rPr>
+        <w:t xml:space="preserve">results/hf_reference_dca.png</w:t>
+      </w:r>
+      <w:r>
+        <w:t xml:space="preserve">).</w:t>
+      </w:r>
+    </w:p>
+    <w:p>
+      <w:pPr>
+        <w:pStyle w:val="Compact"/>
+        <w:numPr>
+          <w:ilvl w:val="0"/>
+          <w:numId w:val="1003"/>
+        </w:numPr>
+      </w:pPr>
+      <w:r>
+        <w:rPr>
+          <w:b/>
+          <w:bCs/>
+        </w:rPr>
         <w:t xml:space="preserve">Supplement</w:t>
       </w:r>
       <w:r>
@@ -4312,10 +4817,34 @@
         <w:t xml:space="preserve">results/tool_capability_map.md</w:t>
       </w:r>
       <w:r>
+        <w:t xml:space="preserve">); model specifications / coefficients</w:t>
+      </w:r>
+      <w:r>
+        <w:t xml:space="preserve"> </w:t>
+      </w:r>
+      <w:r>
+        <w:t xml:space="preserve">(</w:t>
+      </w:r>
+      <w:r>
+        <w:rPr>
+          <w:rStyle w:val="VerbatimChar"/>
+        </w:rPr>
+        <w:t xml:space="preserve">results/model_spec_{hf,ckd,dm}.md</w:t>
+      </w:r>
+      <w:r>
+        <w:t xml:space="preserve">); events-per-variable (</w:t>
+      </w:r>
+      <w:r>
+        <w:rPr>
+          <w:rStyle w:val="VerbatimChar"/>
+        </w:rPr>
+        <w:t xml:space="preserve">results/epv.json</w:t>
+      </w:r>
+      <w:r>
         <w:t xml:space="preserve">).</w:t>
       </w:r>
     </w:p>
-    <w:bookmarkEnd w:id="35"/>
+    <w:bookmarkEnd w:id="36"/>
     <w:sectPr>
       <w:footnotePr>
         <w:numRestart w:val="eachSect"/>

</xml_diff>

<commit_message>
docs(prediction_study): necessity assessment of additions + KFRE cut rationale
KFRE not viable (UACR present in 0.42% of admissions, 2,269/546,028; also predicts ESKD
progression not CKD identification) -> cut with concrete number in Limitation 6. Necessity
verdict (NECESSITY_ASSESSMENT.md): keep all of TRIPOD+AI gaps + the tool sampling-sensitivity;
cut KFRE and the live tool re-load; PREVENT-HF optional/supplement.

Co-Authored-By: Claude Opus 4.8 <noreply@anthropic.com>
</commit_message>
<xml_diff>
--- a/paper/PREDICTION_MANUSCRIPT.docx
+++ b/paper/PREDICTION_MANUSCRIPT.docx
@@ -4226,19 +4226,65 @@
         <w:t xml:space="preserve"> </w:t>
       </w:r>
       <w:r>
-        <w:t xml:space="preserve">guideline-variable reference model, not a faithfully coded KFRE/PCP-HF/PREVENT, because those</w:t>
-      </w:r>
-      <w:r>
-        <w:t xml:space="preserve"> </w:t>
-      </w:r>
-      <w:r>
-        <w:t xml:space="preserve">require predictors absent from MIMIC’s structured tables — itself a finding about CDW-native</w:t>
-      </w:r>
-      <w:r>
-        <w:t xml:space="preserve"> </w:t>
-      </w:r>
-      <w:r>
-        <w:t xml:space="preserve">modelling.</w:t>
+        <w:t xml:space="preserve">guideline-variable reference model, not a faithfully coded KFRE, because that equation requires</w:t>
+      </w:r>
+      <w:r>
+        <w:t xml:space="preserve"> </w:t>
+      </w:r>
+      <w:r>
+        <w:t xml:space="preserve">urine albumin-to-creatinine ratio, present in only</w:t>
+      </w:r>
+      <w:r>
+        <w:t xml:space="preserve"> </w:t>
+      </w:r>
+      <w:r>
+        <w:rPr>
+          <w:b/>
+          <w:bCs/>
+        </w:rPr>
+        <w:t xml:space="preserve">0.42%</w:t>
+      </w:r>
+      <w:r>
+        <w:t xml:space="preserve"> </w:t>
+      </w:r>
+      <w:r>
+        <w:t xml:space="preserve">of admissions (2,269/546,028), and</w:t>
+      </w:r>
+      <w:r>
+        <w:t xml:space="preserve"> </w:t>
+      </w:r>
+      <w:r>
+        <w:t xml:space="preserve">in any case predicts ESKD progression among known-CKD patients rather than CKD identification.</w:t>
+      </w:r>
+      <w:r>
+        <w:t xml:space="preserve"> </w:t>
+      </w:r>
+      <w:r>
+        <w:t xml:space="preserve">The PREVENT heart-failure equation is computable from CDW variables and is reported as a</w:t>
+      </w:r>
+      <w:r>
+        <w:t xml:space="preserve"> </w:t>
+      </w:r>
+      <w:r>
+        <w:t xml:space="preserve">secondary comparator (§3.7); its 10-year-incidence horizon and ambulatory derivation population</w:t>
+      </w:r>
+      <w:r>
+        <w:t xml:space="preserve"> </w:t>
+      </w:r>
+      <w:r>
+        <w:t xml:space="preserve">differ from this ICU identification task, so it is interpreted as a reference, not a gold</w:t>
+      </w:r>
+      <w:r>
+        <w:t xml:space="preserve"> </w:t>
+      </w:r>
+      <w:r>
+        <w:t xml:space="preserve">standard. The sparsity of guideline-equation inputs in structured CDW tables is itself a finding</w:t>
+      </w:r>
+      <w:r>
+        <w:t xml:space="preserve"> </w:t>
+      </w:r>
+      <w:r>
+        <w:t xml:space="preserve">about CDW-native modelling.</w:t>
       </w:r>
     </w:p>
     <w:p>

</xml_diff>

<commit_message>
feat(prediction_study): fold PREVENT-HF comparator into manuscript; finalize study
Add the faithfully-implemented AHA PREVENT 2024 base 10-yr HF equation as a
published-equation comparator (§3.7): ROC AUC 0.778 vs CDW elastic-net 0.808 on
the matched pre-onset (>=180d) cohort. Self-test reproduces paper examples exactly
(F 0.081, M 0.106). Reconcile §2.8 (PREVENT is computable; KFRE/PCP-HF are not).

Marks the prediction study complete: all 4 original items + 4 hardening items
(EPV, coefficients, fairness, PREVENT-HF). Only TRIPOD+AI item 20 (funding/
conflicts) remains, author-supplied. STATE.md updated.

Co-Authored-By: Claude Opus 4.8 <noreply@anthropic.com>
</commit_message>
<xml_diff>
--- a/paper/PREDICTION_MANUSCRIPT.docx
+++ b/paper/PREDICTION_MANUSCRIPT.docx
@@ -1643,25 +1643,31 @@
         <w:t xml:space="preserve"> </w:t>
       </w:r>
       <w:r>
-        <w:t xml:space="preserve">(§3.7). Faithful computation of the published incident-disease equations (PCP-HF, PREVENT, KFRE)</w:t>
-      </w:r>
-      <w:r>
-        <w:t xml:space="preserve"> </w:t>
-      </w:r>
-      <w:r>
-        <w:t xml:space="preserve">requires predictors that are sparse or absent in MIMIC’s structured tables — urine albumin-to-</w:t>
-      </w:r>
-      <w:r>
-        <w:t xml:space="preserve"> </w:t>
-      </w:r>
-      <w:r>
-        <w:t xml:space="preserve">creatinine ratio, a discrete lipid panel, race, QRS duration — so a guideline-variable reference is</w:t>
-      </w:r>
-      <w:r>
-        <w:t xml:space="preserve"> </w:t>
-      </w:r>
-      <w:r>
-        <w:t xml:space="preserve">the honest CDW-native benchmark.</w:t>
+        <w:t xml:space="preserve">(§3.7). The AHA PREVENT 2024 base heart-failure equation is computable from CDW variables and is</w:t>
+      </w:r>
+      <w:r>
+        <w:t xml:space="preserve"> </w:t>
+      </w:r>
+      <w:r>
+        <w:t xml:space="preserve">reported as a secondary published-equation comparator (§3.7). The remaining published incident-</w:t>
+      </w:r>
+      <w:r>
+        <w:t xml:space="preserve"> </w:t>
+      </w:r>
+      <w:r>
+        <w:t xml:space="preserve">disease equations (PCP-HF, KFRE) require predictors that are sparse or absent in MIMIC’s structured</w:t>
+      </w:r>
+      <w:r>
+        <w:t xml:space="preserve"> </w:t>
+      </w:r>
+      <w:r>
+        <w:t xml:space="preserve">tables — urine albumin-to-creatinine ratio, a discrete lipid panel, race, QRS duration — so a</w:t>
+      </w:r>
+      <w:r>
+        <w:t xml:space="preserve"> </w:t>
+      </w:r>
+      <w:r>
+        <w:t xml:space="preserve">guideline-variable reference is the honest CDW-native benchmark for those.</w:t>
       </w:r>
     </w:p>
     <w:bookmarkEnd w:id="18"/>
@@ -3246,6 +3252,116 @@
       </w:r>
       <w:r>
         <w:t xml:space="preserve">tool makes accessible.</w:t>
+      </w:r>
+    </w:p>
+    <w:p>
+      <w:pPr>
+        <w:pStyle w:val="BodyText"/>
+      </w:pPr>
+      <w:r>
+        <w:t xml:space="preserve">As a published-equation reference, we also implemented the AHA</w:t>
+      </w:r>
+      <w:r>
+        <w:t xml:space="preserve"> </w:t>
+      </w:r>
+      <w:r>
+        <w:rPr>
+          <w:b/>
+          <w:bCs/>
+        </w:rPr>
+        <w:t xml:space="preserve">PREVENT 2024</w:t>
+      </w:r>
+      <w:r>
+        <w:t xml:space="preserve"> </w:t>
+      </w:r>
+      <w:r>
+        <w:t xml:space="preserve">base 10-year</w:t>
+      </w:r>
+      <w:r>
+        <w:t xml:space="preserve"> </w:t>
+      </w:r>
+      <w:r>
+        <w:t xml:space="preserve">heart-failure model (sex-specific coefficients from Khan et al., reproduced exactly against the</w:t>
+      </w:r>
+      <w:r>
+        <w:t xml:space="preserve"> </w:t>
+      </w:r>
+      <w:r>
+        <w:t xml:space="preserve">paper’s worked examples: female 0.081, male 0.106) and applied it to the pre-onset incident-HF</w:t>
+      </w:r>
+      <w:r>
+        <w:t xml:space="preserve"> </w:t>
+      </w:r>
+      <w:r>
+        <w:t xml:space="preserve">cohort (features ≥180 days before onset). On that cohort PREVENT reached ROC AUC</w:t>
+      </w:r>
+      <w:r>
+        <w:t xml:space="preserve"> </w:t>
+      </w:r>
+      <w:r>
+        <w:rPr>
+          <w:b/>
+          <w:bCs/>
+        </w:rPr>
+        <w:t xml:space="preserve">0.778</w:t>
+      </w:r>
+      <w:r>
+        <w:t xml:space="preserve"> </w:t>
+      </w:r>
+      <w:r>
+        <w:t xml:space="preserve">versus</w:t>
+      </w:r>
+      <w:r>
+        <w:t xml:space="preserve"> </w:t>
+      </w:r>
+      <w:r>
+        <w:rPr>
+          <w:b/>
+          <w:bCs/>
+        </w:rPr>
+        <w:t xml:space="preserve">0.808</w:t>
+      </w:r>
+      <w:r>
+        <w:t xml:space="preserve"> </w:t>
+      </w:r>
+      <w:r>
+        <w:t xml:space="preserve">for the CDW elastic-net model evaluated on the identical hold-out — the data-driven model</w:t>
+      </w:r>
+      <w:r>
+        <w:t xml:space="preserve"> </w:t>
+      </w:r>
+      <w:r>
+        <w:t xml:space="preserve">modestly outperforming a fixed published equation even when the equation is given its intended</w:t>
+      </w:r>
+      <w:r>
+        <w:t xml:space="preserve"> </w:t>
+      </w:r>
+      <w:r>
+        <w:t xml:space="preserve">incident-prediction framing. PREVENT’s 10-year ambulatory-derivation horizon differs from this ICU</w:t>
+      </w:r>
+      <w:r>
+        <w:t xml:space="preserve"> </w:t>
+      </w:r>
+      <w:r>
+        <w:t xml:space="preserve">identification task, so its absolute risk scale is not expected to calibrate here (median predicted</w:t>
+      </w:r>
+      <w:r>
+        <w:t xml:space="preserve"> </w:t>
+      </w:r>
+      <w:r>
+        <w:t xml:space="preserve">10-year risk 4.2%); we report discrimination only, and the comparison is a transparency reference</w:t>
+      </w:r>
+      <w:r>
+        <w:t xml:space="preserve"> </w:t>
+      </w:r>
+      <w:r>
+        <w:t xml:space="preserve">rather than a competing claim (input coverage in this cohort: systolic BP 59%, BMI 59%, creatinine</w:t>
+      </w:r>
+      <w:r>
+        <w:t xml:space="preserve"> </w:t>
+      </w:r>
+      <w:r>
+        <w:t xml:space="preserve">71%; missing values imputed to cohort medians).</w:t>
       </w:r>
     </w:p>
     <w:bookmarkEnd w:id="28"/>

</xml_diff>

<commit_message>
edit(prediction_study): peer-editor pass on PREDICTION_MANUSCRIPT
Correctness/rigor:
- Fill Table 1 (§3.2): real CKD/DM AUPRC + calibration from ckd_id_full.json
  (0.935/0.770/1.03,0.06) and dm_id_full.json (0.933/0.852/1.00,0.01); no more
  "—"/"~1.0" placeholders.
- Replace the uncited "200-feature DL HF abstract (0.93)" with two verified
  comparators (Choi 2017 JAMIA 0.883; Rao 2022 BEHRT-HF ~0.93), framed honestly
  as an incident-onset discrimination benchmark, not a same-task comparison.
- Add a References section (7 entries; DOIs) — manuscript previously had none.
- Tighten external drop range 0.10–0.17 -> 0.09–0.17 (CKD drop is 0.095).

Style: remove all 45 em dashes (author preference; reduces AI-writing signature),
rewriting each context to commas/parens/colons; numeric en-dash ranges preserved.

Co-Authored-By: Claude Opus 4.8 <noreply@anthropic.com>
</commit_message>
<xml_diff>
--- a/paper/PREDICTION_MANUSCRIPT.docx
+++ b/paper/PREDICTION_MANUSCRIPT.docx
@@ -39,7 +39,7 @@
         <w:pStyle w:val="Date"/>
       </w:pPr>
       <w:r>
-        <w:t xml:space="preserve">Draft — generated 2026-06-20</w:t>
+        <w:t xml:space="preserve">Draft generated 2026-06-20</w:t>
       </w:r>
     </w:p>
     <w:bookmarkStart w:id="9" w:name="abstract"/>
@@ -84,7 +84,7 @@
         <w:t xml:space="preserve"> </w:t>
       </w:r>
       <w:r>
-        <w:t xml:space="preserve">phenotypes — heart failure (HF), chronic kidney disease (CKD), and diabetes — can be built</w:t>
+        <w:t xml:space="preserve">phenotypes (heart failure [HF], chronic kidney disease [CKD], and diabetes) can be built</w:t>
       </w:r>
       <w:r>
         <w:t xml:space="preserve"> </w:t>
@@ -285,7 +285,7 @@
         <w:t xml:space="preserve"> </w:t>
       </w:r>
       <w:r>
-        <w:t xml:space="preserve">useful — HF 0.758 (0.754–0.761), CKD 0.840 (0.838–0.843), diabetes 0.761 (0.758–0.764) — with</w:t>
+        <w:t xml:space="preserve">useful: HF 0.758 (0.754–0.761), CKD 0.840 (0.838–0.843), diabetes 0.761 (0.758–0.764), with</w:t>
       </w:r>
       <w:r>
         <w:t xml:space="preserve"> </w:t>
@@ -418,13 +418,13 @@
         <w:pStyle w:val="FirstParagraph"/>
       </w:pPr>
       <w:r>
-        <w:t xml:space="preserve">Electronic health records and the clinical data warehouses (CDWs) built on them — i2b2, OMOP,</w:t>
-      </w:r>
-      <w:r>
-        <w:t xml:space="preserve"> </w:t>
-      </w:r>
-      <w:r>
-        <w:t xml:space="preserve">TriNetX — have made structured patient data routinely available for research. Yet building a</w:t>
+        <w:t xml:space="preserve">Electronic health records and the clinical data warehouses (CDWs) built on them (i2b2, OMOP,</w:t>
+      </w:r>
+      <w:r>
+        <w:t xml:space="preserve"> </w:t>
+      </w:r>
+      <w:r>
+        <w:t xml:space="preserve">TriNetX) have made structured patient data routinely available for research. Yet building a</w:t>
       </w:r>
       <w:r>
         <w:t xml:space="preserve"> </w:t>
@@ -475,13 +475,13 @@
         <w:t xml:space="preserve">accessibility</w:t>
       </w:r>
       <w:r>
-        <w:t xml:space="preserve">: the people who best understand a phenotype —</w:t>
-      </w:r>
-      <w:r>
-        <w:t xml:space="preserve"> </w:t>
-      </w:r>
-      <w:r>
-        <w:t xml:space="preserve">clinicians, registry curators — usually cannot build the model themselves. Second,</w:t>
+        <w:t xml:space="preserve">: the people who best understand a phenotype</w:t>
+      </w:r>
+      <w:r>
+        <w:t xml:space="preserve"> </w:t>
+      </w:r>
+      <w:r>
+        <w:t xml:space="preserve">(clinicians, registry curators) usually cannot build the model themselves. Second,</w:t>
       </w:r>
       <w:r>
         <w:t xml:space="preserve"> </w:t>
@@ -526,7 +526,7 @@
         <w:t xml:space="preserve"> </w:t>
       </w:r>
       <w:r>
-        <w:t xml:space="preserve">analytic evidence — exactly the elements bespoke pipelines tend to omit.</w:t>
+        <w:t xml:space="preserve">analytic evidence, exactly the elements bespoke pipelines tend to omit.</w:t>
       </w:r>
     </w:p>
     <w:p>
@@ -553,10 +553,7 @@
         <w:t xml:space="preserve">natively in a CDW</w:t>
       </w:r>
       <w:r>
-        <w:t xml:space="preserve"> </w:t>
-      </w:r>
-      <w:r>
-        <w:t xml:space="preserve">— and that the model-fitting step is</w:t>
+        <w:t xml:space="preserve">, with the model-fitting step</w:t>
       </w:r>
       <w:r>
         <w:t xml:space="preserve"> </w:t>
@@ -584,7 +581,7 @@
         <w:t xml:space="preserve"> </w:t>
       </w:r>
       <w:r>
-        <w:t xml:space="preserve">it — while wrapping that step in the full external-validity discipline: an aligned development</w:t>
+        <w:t xml:space="preserve">it, while wrapping that step in the full external-validity discipline: an aligned development</w:t>
       </w:r>
       <w:r>
         <w:t xml:space="preserve"> </w:t>
@@ -838,10 +835,7 @@
         <w:t xml:space="preserve">Heart failure</w:t>
       </w:r>
       <w:r>
-        <w:t xml:space="preserve"> </w:t>
-      </w:r>
-      <w:r>
-        <w:t xml:space="preserve">— ICD-10</w:t>
+        <w:t xml:space="preserve">: ICD-10</w:t>
       </w:r>
       <w:r>
         <w:t xml:space="preserve"> </w:t>
@@ -887,10 +881,7 @@
         <w:t xml:space="preserve">Chronic kidney disease</w:t>
       </w:r>
       <w:r>
-        <w:t xml:space="preserve"> </w:t>
-      </w:r>
-      <w:r>
-        <w:t xml:space="preserve">— ICD-10</w:t>
+        <w:t xml:space="preserve">: ICD-10</w:t>
       </w:r>
       <w:r>
         <w:t xml:space="preserve"> </w:t>
@@ -936,10 +927,7 @@
         <w:t xml:space="preserve">Diabetes</w:t>
       </w:r>
       <w:r>
-        <w:t xml:space="preserve"> </w:t>
-      </w:r>
-      <w:r>
-        <w:t xml:space="preserve">— ICD-10</w:t>
+        <w:t xml:space="preserve">: ICD-10</w:t>
       </w:r>
       <w:r>
         <w:t xml:space="preserve"> </w:t>
@@ -1354,7 +1342,7 @@
         <w:t xml:space="preserve"> </w:t>
       </w:r>
       <w:r>
-        <w:t xml:space="preserve">93,415 (diabetes) events against 44–45 candidate predictors — an events-per-variable of 1,254–2,123,</w:t>
+        <w:t xml:space="preserve">93,415 (diabetes) events against 44–45 candidate predictors, an events-per-variable of 1,254–2,123,</w:t>
       </w:r>
       <w:r>
         <w:t xml:space="preserve"> </w:t>
@@ -1461,7 +1449,7 @@
         <w:t xml:space="preserve"> </w:t>
       </w:r>
       <w:r>
-        <w:t xml:space="preserve">(AUROC is invariant to a monotone transform of risk) — only calibration — which is the expected and</w:t>
+        <w:t xml:space="preserve">(AUROC is invariant to a monotone transform of risk), only calibration, which is the expected and</w:t>
       </w:r>
       <w:r>
         <w:t xml:space="preserve"> </w:t>
@@ -1549,7 +1537,7 @@
         <w:t xml:space="preserve"> </w:t>
       </w:r>
       <w:r>
-        <w:t xml:space="preserve">disease rather than biological onset — a limitation we state explicitly (§4) — and the defining</w:t>
+        <w:t xml:space="preserve">disease rather than biological onset (a limitation we state explicitly, §4), and the defining</w:t>
       </w:r>
       <w:r>
         <w:t xml:space="preserve"> </w:t>
@@ -1661,7 +1649,7 @@
         <w:t xml:space="preserve"> </w:t>
       </w:r>
       <w:r>
-        <w:t xml:space="preserve">tables — urine albumin-to-creatinine ratio, a discrete lipid panel, race, QRS duration — so a</w:t>
+        <w:t xml:space="preserve">tables (urine albumin-to-creatinine ratio, a discrete lipid panel, race, QRS duration), so a</w:t>
       </w:r>
       <w:r>
         <w:t xml:space="preserve"> </w:t>
@@ -2059,29 +2047,29 @@
               <w:pStyle w:val="Compact"/>
             </w:pPr>
             <w:r>
-              <w:t xml:space="preserve">0.935</w:t>
-            </w:r>
-          </w:p>
-        </w:tc>
-        <w:tc>
-          <w:tcPr/>
-          <w:p>
-            <w:pPr>
-              <w:pStyle w:val="Compact"/>
-            </w:pPr>
-            <w:r>
-              <w:t xml:space="preserve">—</w:t>
-            </w:r>
-          </w:p>
-        </w:tc>
-        <w:tc>
-          <w:tcPr/>
-          <w:p>
-            <w:pPr>
-              <w:pStyle w:val="Compact"/>
-            </w:pPr>
-            <w:r>
-              <w:t xml:space="preserve">~1.0</w:t>
+              <w:t xml:space="preserve">0.935 (0.933–0.936)</w:t>
+            </w:r>
+          </w:p>
+        </w:tc>
+        <w:tc>
+          <w:tcPr/>
+          <w:p>
+            <w:pPr>
+              <w:pStyle w:val="Compact"/>
+            </w:pPr>
+            <w:r>
+              <w:t xml:space="preserve">0.770</w:t>
+            </w:r>
+          </w:p>
+        </w:tc>
+        <w:tc>
+          <w:tcPr/>
+          <w:p>
+            <w:pPr>
+              <w:pStyle w:val="Compact"/>
+            </w:pPr>
+            <w:r>
+              <w:t xml:space="preserve">1.03 / 0.06</w:t>
             </w:r>
           </w:p>
         </w:tc>
@@ -2105,29 +2093,29 @@
               <w:pStyle w:val="Compact"/>
             </w:pPr>
             <w:r>
-              <w:t xml:space="preserve">0.933</w:t>
-            </w:r>
-          </w:p>
-        </w:tc>
-        <w:tc>
-          <w:tcPr/>
-          <w:p>
-            <w:pPr>
-              <w:pStyle w:val="Compact"/>
-            </w:pPr>
-            <w:r>
-              <w:t xml:space="preserve">—</w:t>
-            </w:r>
-          </w:p>
-        </w:tc>
-        <w:tc>
-          <w:tcPr/>
-          <w:p>
-            <w:pPr>
-              <w:pStyle w:val="Compact"/>
-            </w:pPr>
-            <w:r>
-              <w:t xml:space="preserve">~1.0</w:t>
+              <w:t xml:space="preserve">0.933 (0.931–0.934)</w:t>
+            </w:r>
+          </w:p>
+        </w:tc>
+        <w:tc>
+          <w:tcPr/>
+          <w:p>
+            <w:pPr>
+              <w:pStyle w:val="Compact"/>
+            </w:pPr>
+            <w:r>
+              <w:t xml:space="preserve">0.852</w:t>
+            </w:r>
+          </w:p>
+        </w:tc>
+        <w:tc>
+          <w:tcPr/>
+          <w:p>
+            <w:pPr>
+              <w:pStyle w:val="Compact"/>
+            </w:pPr>
+            <w:r>
+              <w:t xml:space="preserve">1.00 / 0.01</w:t>
             </w:r>
           </w:p>
         </w:tc>
@@ -2138,19 +2126,53 @@
         <w:pStyle w:val="BodyText"/>
       </w:pPr>
       <w:r>
-        <w:t xml:space="preserve">The HF figure (0.907, calibrated, 30 features + logistic regression) is competitive with a</w:t>
-      </w:r>
-      <w:r>
-        <w:t xml:space="preserve"> </w:t>
-      </w:r>
-      <w:r>
-        <w:t xml:space="preserve">published 200-feature deep-learning HF abstract (ROC AUC 0.93), at a fraction of the feature</w:t>
-      </w:r>
-      <w:r>
-        <w:t xml:space="preserve"> </w:t>
-      </w:r>
-      <w:r>
-        <w:t xml:space="preserve">budget and with explicit calibration.</w:t>
+        <w:t xml:space="preserve">The HF figure (0.907, calibrated, 30 features, logistic regression) is comparable to the</w:t>
+      </w:r>
+      <w:r>
+        <w:t xml:space="preserve"> </w:t>
+      </w:r>
+      <w:r>
+        <w:t xml:space="preserve">discrimination reported for substantially higher-dimensional deep-learning EHR models of heart</w:t>
+      </w:r>
+      <w:r>
+        <w:t xml:space="preserve"> </w:t>
+      </w:r>
+      <w:r>
+        <w:t xml:space="preserve">failure (ROC AUC ~0.88–0.93; Choi et al. 2017 [1], Rao et al. 2022 [2]), attained here with a far</w:t>
+      </w:r>
+      <w:r>
+        <w:t xml:space="preserve"> </w:t>
+      </w:r>
+      <w:r>
+        <w:t xml:space="preserve">smaller feature set and, unlike most such reports, with explicit calibration and external</w:t>
+      </w:r>
+      <w:r>
+        <w:t xml:space="preserve"> </w:t>
+      </w:r>
+      <w:r>
+        <w:t xml:space="preserve">validation. Those models target</w:t>
+      </w:r>
+      <w:r>
+        <w:t xml:space="preserve"> </w:t>
+      </w:r>
+      <w:r>
+        <w:rPr>
+          <w:i/>
+          <w:iCs/>
+        </w:rPr>
+        <w:t xml:space="preserve">incident</w:t>
+      </w:r>
+      <w:r>
+        <w:t xml:space="preserve"> </w:t>
+      </w:r>
+      <w:r>
+        <w:t xml:space="preserve">HF onset rather than identification of prevalent</w:t>
+      </w:r>
+      <w:r>
+        <w:t xml:space="preserve"> </w:t>
+      </w:r>
+      <w:r>
+        <w:t xml:space="preserve">disease, so this is a benchmark of achievable discrimination, not a same-task comparison.</w:t>
       </w:r>
     </w:p>
     <w:bookmarkEnd w:id="23"/>
@@ -2168,13 +2190,13 @@
         <w:pStyle w:val="FirstParagraph"/>
       </w:pPr>
       <w:r>
-        <w:t xml:space="preserve">Applied frozen to eICU-CRD, discrimination degraded honestly but remained useful, and calibration</w:t>
-      </w:r>
-      <w:r>
-        <w:t xml:space="preserve"> </w:t>
-      </w:r>
-      <w:r>
-        <w:t xml:space="preserve">— over-confident on transport — was restored to near-ideal by intercept+slope recalibration in</w:t>
+        <w:t xml:space="preserve">Applied frozen to eICU-CRD, discrimination degraded honestly but remained useful, and calibration,</w:t>
+      </w:r>
+      <w:r>
+        <w:t xml:space="preserve"> </w:t>
+      </w:r>
+      <w:r>
+        <w:t xml:space="preserve">over-confident on transport, was restored to near-ideal by intercept+slope recalibration in</w:t>
       </w:r>
       <w:r>
         <w:t xml:space="preserve"> </w:t>
@@ -2411,7 +2433,7 @@
         <w:t xml:space="preserve"> </w:t>
       </w:r>
       <w:r>
-        <w:t xml:space="preserve">real, reportable margin (0.10–0.17 AUROC) across health systems, with</w:t>
+        <w:t xml:space="preserve">real, reportable margin (0.09–0.17 AUROC) across health systems, with</w:t>
       </w:r>
       <w:r>
         <w:t xml:space="preserve"> </w:t>
@@ -2427,7 +2449,7 @@
         <w:t xml:space="preserve"> </w:t>
       </w:r>
       <w:r>
-        <w:t xml:space="preserve">(0.840) — the phenotype most anchored to an objective, well-measured laboratory (creatinine).</w:t>
+        <w:t xml:space="preserve">(0.840), the phenotype most anchored to an objective, well-measured laboratory (creatinine).</w:t>
       </w:r>
       <w:r>
         <w:t xml:space="preserve"> </w:t>
@@ -3046,7 +3068,7 @@
         <w:t xml:space="preserve"> </w:t>
       </w:r>
       <w:r>
-        <w:t xml:space="preserve">that this sampling — not a genuinely different model — explains the tool’s marginally higher</w:t>
+        <w:t xml:space="preserve">that this sampling, not a genuinely different model, explains the tool’s marginally higher</w:t>
       </w:r>
       <w:r>
         <w:t xml:space="preserve"> </w:t>
@@ -3093,7 +3115,7 @@
         <w:t xml:space="preserve"> </w:t>
       </w:r>
       <w:r>
-        <w:t xml:space="preserve">balanced sampling therefore does not inflate discrimination, and the central point stands —</w:t>
+        <w:t xml:space="preserve">balanced sampling therefore does not inflate discrimination, and the central point stands:</w:t>
       </w:r>
       <w:r>
         <w:t xml:space="preserve"> </w:t>
@@ -3136,19 +3158,19 @@
         <w:pStyle w:val="FirstParagraph"/>
       </w:pPr>
       <w:r>
-        <w:t xml:space="preserve">A guideline-variable reference model — the eight established cardiometabolic risk factors available</w:t>
-      </w:r>
-      <w:r>
-        <w:t xml:space="preserve"> </w:t>
-      </w:r>
-      <w:r>
-        <w:t xml:space="preserve">in the CDW (age, sex, systolic blood pressure, antihypertensive treatment, diabetes, smoking, BMI,</w:t>
-      </w:r>
-      <w:r>
-        <w:t xml:space="preserve"> </w:t>
-      </w:r>
-      <w:r>
-        <w:t xml:space="preserve">and a race-free CKD-EPI 2021 eGFR derived from serum creatinine) — reached internal ROC AUC</w:t>
+        <w:t xml:space="preserve">A guideline-variable reference model, built from the eight established cardiometabolic risk factors</w:t>
+      </w:r>
+      <w:r>
+        <w:t xml:space="preserve"> </w:t>
+      </w:r>
+      <w:r>
+        <w:t xml:space="preserve">available in the CDW (age, sex, systolic blood pressure, antihypertensive treatment, diabetes,</w:t>
+      </w:r>
+      <w:r>
+        <w:t xml:space="preserve"> </w:t>
+      </w:r>
+      <w:r>
+        <w:t xml:space="preserve">smoking, BMI, and a race-free CKD-EPI 2021 eGFR derived from serum creatinine), reached internal ROC AUC</w:t>
       </w:r>
       <w:r>
         <w:t xml:space="preserve"> </w:t>
@@ -3245,7 +3267,7 @@
         <w:t xml:space="preserve"> </w:t>
       </w:r>
       <w:r>
-        <w:t xml:space="preserve">over an established-risk-factor baseline — the marginal value of the broader laboratory panel the</w:t>
+        <w:t xml:space="preserve">over an established-risk-factor baseline: the marginal value of the broader laboratory panel the</w:t>
       </w:r>
       <w:r>
         <w:t xml:space="preserve"> </w:t>
@@ -3325,13 +3347,13 @@
         <w:t xml:space="preserve"> </w:t>
       </w:r>
       <w:r>
-        <w:t xml:space="preserve">for the CDW elastic-net model evaluated on the identical hold-out — the data-driven model</w:t>
-      </w:r>
-      <w:r>
-        <w:t xml:space="preserve"> </w:t>
-      </w:r>
-      <w:r>
-        <w:t xml:space="preserve">modestly outperforming a fixed published equation even when the equation is given its intended</w:t>
+        <w:t xml:space="preserve">for the CDW elastic-net model evaluated on the identical hold-out, with the data-driven</w:t>
+      </w:r>
+      <w:r>
+        <w:t xml:space="preserve"> </w:t>
+      </w:r>
+      <w:r>
+        <w:t xml:space="preserve">model modestly outperforming a fixed published equation even when the equation is given its intended</w:t>
       </w:r>
       <w:r>
         <w:t xml:space="preserve"> </w:t>
@@ -3498,7 +3520,7 @@
         <w:t xml:space="preserve"> </w:t>
       </w:r>
       <w:r>
-        <w:t xml:space="preserve">same internal-holdout code reproduced 0.933 exactly — 0.9329 — confirming the harness and the tool</w:t>
+        <w:t xml:space="preserve">same internal-holdout code reproduced 0.933 exactly (0.9329), confirming the harness and the tool</w:t>
       </w:r>
       <w:r>
         <w:t xml:space="preserve"> </w:t>
@@ -3854,7 +3876,7 @@
         <w:t xml:space="preserve"> </w:t>
       </w:r>
       <w:r>
-        <w:t xml:space="preserve">diffuse — comorbidity and polypharmacy compress the feature contrast between cases and non-cases —</w:t>
+        <w:t xml:space="preserve">diffuse (comorbidity and polypharmacy compress the feature contrast between cases and non-cases),</w:t>
       </w:r>
       <w:r>
         <w:t xml:space="preserve"> </w:t>
@@ -3961,23 +3983,20 @@
         <w:t xml:space="preserve"> </w:t>
       </w:r>
       <w:r>
-        <w:t xml:space="preserve">and prescribing patterns that differ between hospitals. This supports our secondary hypothesis —</w:t>
-      </w:r>
-      <w:r>
-        <w:t xml:space="preserve"> </w:t>
-      </w:r>
-      <w:r>
-        <w:rPr>
-          <w:b/>
-          <w:bCs/>
-        </w:rPr>
-        <w:t xml:space="preserve">laboratory features transport better than diagnosis codes</w:t>
-      </w:r>
-      <w:r>
-        <w:t xml:space="preserve"> </w:t>
-      </w:r>
-      <w:r>
-        <w:t xml:space="preserve">— and is actionable: portable CDW</w:t>
+        <w:t xml:space="preserve">and prescribing patterns that differ between hospitals. This supports our secondary hypothesis,</w:t>
+      </w:r>
+      <w:r>
+        <w:t xml:space="preserve"> </w:t>
+      </w:r>
+      <w:r>
+        <w:rPr>
+          <w:b/>
+          <w:bCs/>
+        </w:rPr>
+        <w:t xml:space="preserve">that laboratory features transport better than diagnosis codes</w:t>
+      </w:r>
+      <w:r>
+        <w:t xml:space="preserve">, and is actionable: portable CDW</w:t>
       </w:r>
       <w:r>
         <w:t xml:space="preserve"> </w:t>
@@ -4019,7 +4038,7 @@
         <w:t xml:space="preserve"> </w:t>
       </w:r>
       <w:r>
-        <w:t xml:space="preserve">calibrated. Reporting both, connected by the ablation, is more defensible than either alone — and</w:t>
+        <w:t xml:space="preserve">calibrated. Reporting both, connected by the ablation, is more defensible than either alone, and</w:t>
       </w:r>
       <w:r>
         <w:t xml:space="preserve"> </w:t>
@@ -4061,13 +4080,13 @@
         <w:t xml:space="preserve"> </w:t>
       </w:r>
       <w:r>
-        <w:t xml:space="preserve">through a JSON API by someone who is not an ML specialist, while the surrounding study design —</w:t>
-      </w:r>
-      <w:r>
-        <w:t xml:space="preserve"> </w:t>
-      </w:r>
-      <w:r>
-        <w:t xml:space="preserve">which is phenotype-agnostic and reusable — supplies the external-validity discipline reviewers</w:t>
+        <w:t xml:space="preserve">through a JSON API by someone who is not an ML specialist, while the surrounding study design,</w:t>
+      </w:r>
+      <w:r>
+        <w:t xml:space="preserve"> </w:t>
+      </w:r>
+      <w:r>
+        <w:t xml:space="preserve">which is phenotype-agnostic and reusable, supplies the external-validity discipline reviewers</w:t>
       </w:r>
       <w:r>
         <w:t xml:space="preserve"> </w:t>
@@ -4091,25 +4110,31 @@
         <w:t xml:space="preserve"> </w:t>
       </w:r>
       <w:r>
-        <w:t xml:space="preserve">Our internal HF discrimination (0.907) matches deep-learning HF</w:t>
-      </w:r>
-      <w:r>
-        <w:t xml:space="preserve"> </w:t>
-      </w:r>
-      <w:r>
-        <w:t xml:space="preserve">models that use far more features, but unlike most such reports we add external validation across</w:t>
-      </w:r>
-      <w:r>
-        <w:t xml:space="preserve"> </w:t>
-      </w:r>
-      <w:r>
-        <w:t xml:space="preserve">hundreds of hospitals, explicit calibration and recalibration, an ablation, and DCA — the elements</w:t>
-      </w:r>
-      <w:r>
-        <w:t xml:space="preserve"> </w:t>
-      </w:r>
-      <w:r>
-        <w:t xml:space="preserve">TRIPOD+AI and PROBAST require and that single-center model papers commonly omit.</w:t>
+        <w:t xml:space="preserve">Our internal HF discrimination (0.907) is in the range reported for</w:t>
+      </w:r>
+      <w:r>
+        <w:t xml:space="preserve"> </w:t>
+      </w:r>
+      <w:r>
+        <w:t xml:space="preserve">deep-learning EHR models of heart failure that use orders of magnitude more inputs (ROC AUC</w:t>
+      </w:r>
+      <w:r>
+        <w:t xml:space="preserve"> </w:t>
+      </w:r>
+      <w:r>
+        <w:t xml:space="preserve">~0.88–0.93 [1,2]), but unlike most such reports we add external validation across hundreds of</w:t>
+      </w:r>
+      <w:r>
+        <w:t xml:space="preserve"> </w:t>
+      </w:r>
+      <w:r>
+        <w:t xml:space="preserve">hospitals, explicit calibration and recalibration, an ablation, and DCA: the elements TRIPOD+AI and</w:t>
+      </w:r>
+      <w:r>
+        <w:t xml:space="preserve"> </w:t>
+      </w:r>
+      <w:r>
+        <w:t xml:space="preserve">PROBAST require and that single-center model papers commonly omit.</w:t>
       </w:r>
     </w:p>
     <w:bookmarkEnd w:id="32"/>
@@ -4458,13 +4483,13 @@
         <w:t xml:space="preserve"> </w:t>
       </w:r>
       <w:r>
-        <w:t xml:space="preserve">built natively in a clinical data warehouse, calibrated, and — after a simple intercept+slope</w:t>
-      </w:r>
-      <w:r>
-        <w:t xml:space="preserve"> </w:t>
-      </w:r>
-      <w:r>
-        <w:t xml:space="preserve">recalibration — transported to hundreds of other hospitals, with objective laboratory features</w:t>
+        <w:t xml:space="preserve">built natively in a clinical data warehouse, calibrated, and, after a simple intercept+slope</w:t>
+      </w:r>
+      <w:r>
+        <w:t xml:space="preserve"> </w:t>
+      </w:r>
+      <w:r>
+        <w:t xml:space="preserve">recalibration, transported to hundreds of other hospitals, with objective laboratory features</w:t>
       </w:r>
       <w:r>
         <w:t xml:space="preserve"> </w:t>
@@ -4492,157 +4517,13 @@
       </w:r>
     </w:p>
     <w:bookmarkEnd w:id="34"/>
-    <w:bookmarkStart w:id="35" w:name="data-and-code-availability"/>
+    <w:bookmarkStart w:id="35" w:name="references"/>
     <w:p>
       <w:pPr>
         <w:pStyle w:val="Heading2"/>
       </w:pPr>
       <w:r>
-        <w:t xml:space="preserve">Data and code availability</w:t>
-      </w:r>
-    </w:p>
-    <w:p>
-      <w:pPr>
-        <w:pStyle w:val="FirstParagraph"/>
-      </w:pPr>
-      <w:r>
-        <w:t xml:space="preserve">MIMIC-IV and eICU-CRD are available to credentialed users on PhysioNet. All cohort SQL</w:t>
-      </w:r>
-      <w:r>
-        <w:t xml:space="preserve"> </w:t>
-      </w:r>
-      <w:r>
-        <w:t xml:space="preserve">(</w:t>
-      </w:r>
-      <w:r>
-        <w:rPr>
-          <w:rStyle w:val="VerbatimChar"/>
-        </w:rPr>
-        <w:t xml:space="preserve">prediction_study/cohort_*.sql</w:t>
-      </w:r>
-      <w:r>
-        <w:t xml:space="preserve">), model and evaluation code (</w:t>
-      </w:r>
-      <w:r>
-        <w:rPr>
-          <w:rStyle w:val="VerbatimChar"/>
-        </w:rPr>
-        <w:t xml:space="preserve">evaluate.py</w:t>
-      </w:r>
-      <w:r>
-        <w:t xml:space="preserve">,</w:t>
-      </w:r>
-      <w:r>
-        <w:t xml:space="preserve"> </w:t>
-      </w:r>
-      <w:r>
-        <w:rPr>
-          <w:rStyle w:val="VerbatimChar"/>
-        </w:rPr>
-        <w:t xml:space="preserve">external_validate.py</w:t>
-      </w:r>
-      <w:r>
-        <w:t xml:space="preserve">,</w:t>
-      </w:r>
-      <w:r>
-        <w:t xml:space="preserve"> </w:t>
-      </w:r>
-      <w:r>
-        <w:rPr>
-          <w:rStyle w:val="VerbatimChar"/>
-        </w:rPr>
-        <w:t xml:space="preserve">identify_eval.py</w:t>
-      </w:r>
-      <w:r>
-        <w:t xml:space="preserve">,</w:t>
-      </w:r>
-      <w:r>
-        <w:t xml:space="preserve"> </w:t>
-      </w:r>
-      <w:r>
-        <w:rPr>
-          <w:rStyle w:val="VerbatimChar"/>
-        </w:rPr>
-        <w:t xml:space="preserve">dca.py</w:t>
-      </w:r>
-      <w:r>
-        <w:t xml:space="preserve">,</w:t>
-      </w:r>
-      <w:r>
-        <w:t xml:space="preserve"> </w:t>
-      </w:r>
-      <w:r>
-        <w:rPr>
-          <w:rStyle w:val="VerbatimChar"/>
-        </w:rPr>
-        <w:t xml:space="preserve">make_decay_figure.py</w:t>
-      </w:r>
-      <w:r>
-        <w:t xml:space="preserve">), the i2b2-ML build driver</w:t>
-      </w:r>
-      <w:r>
-        <w:t xml:space="preserve"> </w:t>
-      </w:r>
-      <w:r>
-        <w:t xml:space="preserve">(</w:t>
-      </w:r>
-      <w:r>
-        <w:rPr>
-          <w:rStyle w:val="VerbatimChar"/>
-        </w:rPr>
-        <w:t xml:space="preserve">pipeline/load_and_build.sh</w:t>
-      </w:r>
-      <w:r>
-        <w:t xml:space="preserve">,</w:t>
-      </w:r>
-      <w:r>
-        <w:t xml:space="preserve"> </w:t>
-      </w:r>
-      <w:r>
-        <w:rPr>
-          <w:rStyle w:val="VerbatimChar"/>
-        </w:rPr>
-        <w:t xml:space="preserve">pipeline/run_ml_build.py</w:t>
-      </w:r>
-      <w:r>
-        <w:t xml:space="preserve">), and all result artifacts and figures</w:t>
-      </w:r>
-      <w:r>
-        <w:t xml:space="preserve"> </w:t>
-      </w:r>
-      <w:r>
-        <w:t xml:space="preserve">(</w:t>
-      </w:r>
-      <w:r>
-        <w:rPr>
-          <w:rStyle w:val="VerbatimChar"/>
-        </w:rPr>
-        <w:t xml:space="preserve">prediction_study/results/</w:t>
-      </w:r>
-      <w:r>
-        <w:t xml:space="preserve">) are released in the project repository under branch</w:t>
-      </w:r>
-      <w:r>
-        <w:t xml:space="preserve"> </w:t>
-      </w:r>
-      <w:r>
-        <w:rPr>
-          <w:rStyle w:val="VerbatimChar"/>
-        </w:rPr>
-        <w:t xml:space="preserve">feature/phenotype-ml-pipeline</w:t>
-      </w:r>
-      <w:r>
-        <w:t xml:space="preserve">.</w:t>
-      </w:r>
-    </w:p>
-    <w:bookmarkEnd w:id="35"/>
-    <w:bookmarkStart w:id="36" w:name="tables-and-figures"/>
-    <w:p>
-      <w:pPr>
-        <w:pStyle w:val="Heading2"/>
-      </w:pPr>
-      <w:r>
-        <w:t xml:space="preserve">Tables and figures</w:t>
+        <w:t xml:space="preserve">References</w:t>
       </w:r>
     </w:p>
     <w:p>
@@ -4654,17 +4535,29 @@
         </w:numPr>
       </w:pPr>
       <w:r>
-        <w:rPr>
-          <w:b/>
-          <w:bCs/>
-        </w:rPr>
-        <w:t xml:space="preserve">Table 1</w:t>
-      </w:r>
-      <w:r>
-        <w:t xml:space="preserve"> </w:t>
-      </w:r>
-      <w:r>
-        <w:t xml:space="preserve">— internal discrimination/calibration (§3.2).</w:t>
+        <w:t xml:space="preserve">Choi E, Schuetz A, Stewart WF, Sun J. Using recurrent neural network models for early detection</w:t>
+      </w:r>
+      <w:r>
+        <w:t xml:space="preserve"> </w:t>
+      </w:r>
+      <w:r>
+        <w:t xml:space="preserve">of heart failure onset.</w:t>
+      </w:r>
+      <w:r>
+        <w:t xml:space="preserve"> </w:t>
+      </w:r>
+      <w:r>
+        <w:rPr>
+          <w:i/>
+          <w:iCs/>
+        </w:rPr>
+        <w:t xml:space="preserve">J Am Med Inform Assoc.</w:t>
+      </w:r>
+      <w:r>
+        <w:t xml:space="preserve"> </w:t>
+      </w:r>
+      <w:r>
+        <w:t xml:space="preserve">2017;24(2):361–370. doi:10.1093/jamia/ocw112</w:t>
       </w:r>
     </w:p>
     <w:p>
@@ -4676,26 +4569,35 @@
         </w:numPr>
       </w:pPr>
       <w:r>
-        <w:rPr>
-          <w:b/>
-          <w:bCs/>
-        </w:rPr>
-        <w:t xml:space="preserve">Table 2</w:t>
-      </w:r>
-      <w:r>
-        <w:t xml:space="preserve"> </w:t>
-      </w:r>
-      <w:r>
-        <w:t xml:space="preserve">— internal vs external + recalibration (</w:t>
-      </w:r>
-      <w:r>
-        <w:rPr>
-          <w:rStyle w:val="VerbatimChar"/>
-        </w:rPr>
-        <w:t xml:space="preserve">results/external_validation_summary.md</w:t>
-      </w:r>
-      <w:r>
-        <w:t xml:space="preserve">).</w:t>
+        <w:t xml:space="preserve">Rao S, Li Y, Ramakrishnan R, et al. An explainable transformer-based deep learning model for the</w:t>
+      </w:r>
+      <w:r>
+        <w:t xml:space="preserve"> </w:t>
+      </w:r>
+      <w:r>
+        <w:t xml:space="preserve">prediction of incident heart failure.</w:t>
+      </w:r>
+      <w:r>
+        <w:t xml:space="preserve"> </w:t>
+      </w:r>
+      <w:r>
+        <w:rPr>
+          <w:i/>
+          <w:iCs/>
+        </w:rPr>
+        <w:t xml:space="preserve">IEEE J Biomed Health Inform.</w:t>
+      </w:r>
+      <w:r>
+        <w:t xml:space="preserve"> </w:t>
+      </w:r>
+      <w:r>
+        <w:t xml:space="preserve">2022;26(7):3362–3372.</w:t>
+      </w:r>
+      <w:r>
+        <w:t xml:space="preserve"> </w:t>
+      </w:r>
+      <w:r>
+        <w:t xml:space="preserve">doi:10.1109/JBHI.2022.3148820</w:t>
       </w:r>
     </w:p>
     <w:p>
@@ -4707,26 +4609,29 @@
         </w:numPr>
       </w:pPr>
       <w:r>
-        <w:rPr>
-          <w:b/>
-          <w:bCs/>
-        </w:rPr>
-        <w:t xml:space="preserve">Table 3</w:t>
-      </w:r>
-      <w:r>
-        <w:t xml:space="preserve"> </w:t>
-      </w:r>
-      <w:r>
-        <w:t xml:space="preserve">— leakage-decay (</w:t>
-      </w:r>
-      <w:r>
-        <w:rPr>
-          <w:rStyle w:val="VerbatimChar"/>
-        </w:rPr>
-        <w:t xml:space="preserve">results/{hf,ckd,dm}_decay_table.md</w:t>
-      </w:r>
-      <w:r>
-        <w:t xml:space="preserve">).</w:t>
+        <w:t xml:space="preserve">Khan SS, Matsushita K, Sang Y, et al. Development and validation of the American Heart</w:t>
+      </w:r>
+      <w:r>
+        <w:t xml:space="preserve"> </w:t>
+      </w:r>
+      <w:r>
+        <w:t xml:space="preserve">Association’s Predicting Risk of Cardiovascular Disease EVENTs (PREVENT) equations.</w:t>
+      </w:r>
+      <w:r>
+        <w:t xml:space="preserve"> </w:t>
+      </w:r>
+      <w:r>
+        <w:rPr>
+          <w:i/>
+          <w:iCs/>
+        </w:rPr>
+        <w:t xml:space="preserve">Circulation.</w:t>
+      </w:r>
+      <w:r>
+        <w:t xml:space="preserve"> </w:t>
+      </w:r>
+      <w:r>
+        <w:t xml:space="preserve">2024;149(6):430–449. doi:10.1161/CIRCULATIONAHA.123.067626</w:t>
       </w:r>
     </w:p>
     <w:p>
@@ -4738,26 +4643,29 @@
         </w:numPr>
       </w:pPr>
       <w:r>
-        <w:rPr>
-          <w:b/>
-          <w:bCs/>
-        </w:rPr>
-        <w:t xml:space="preserve">Table 4</w:t>
-      </w:r>
-      <w:r>
-        <w:t xml:space="preserve"> </w:t>
-      </w:r>
-      <w:r>
-        <w:t xml:space="preserve">— tool vs harness (</w:t>
-      </w:r>
-      <w:r>
-        <w:rPr>
-          <w:rStyle w:val="VerbatimChar"/>
-        </w:rPr>
-        <w:t xml:space="preserve">results/tool_capability_map.md</w:t>
-      </w:r>
-      <w:r>
-        <w:t xml:space="preserve">).</w:t>
+        <w:t xml:space="preserve">Collins GS, Moons KGM, Dhiman P, et al. TRIPOD+AI statement: updated guidance for reporting</w:t>
+      </w:r>
+      <w:r>
+        <w:t xml:space="preserve"> </w:t>
+      </w:r>
+      <w:r>
+        <w:t xml:space="preserve">clinical prediction models that use regression or machine learning methods.</w:t>
+      </w:r>
+      <w:r>
+        <w:t xml:space="preserve"> </w:t>
+      </w:r>
+      <w:r>
+        <w:rPr>
+          <w:i/>
+          <w:iCs/>
+        </w:rPr>
+        <w:t xml:space="preserve">BMJ.</w:t>
+      </w:r>
+      <w:r>
+        <w:t xml:space="preserve"> </w:t>
+      </w:r>
+      <w:r>
+        <w:t xml:space="preserve">2024;385:e078378. doi:10.1136/bmj-2023-078378</w:t>
       </w:r>
     </w:p>
     <w:p>
@@ -4769,38 +4677,29 @@
         </w:numPr>
       </w:pPr>
       <w:r>
-        <w:rPr>
-          <w:b/>
-          <w:bCs/>
-        </w:rPr>
-        <w:t xml:space="preserve">Table 5</w:t>
-      </w:r>
-      <w:r>
-        <w:t xml:space="preserve"> </w:t>
-      </w:r>
-      <w:r>
-        <w:t xml:space="preserve">— subgroup performance by sex and age (</w:t>
-      </w:r>
-      <w:r>
-        <w:rPr>
-          <w:rStyle w:val="VerbatimChar"/>
-        </w:rPr>
-        <w:t xml:space="preserve">results/model_audit_summary.md</w:t>
-      </w:r>
-      <w:r>
-        <w:t xml:space="preserve">,</w:t>
-      </w:r>
-      <w:r>
-        <w:t xml:space="preserve"> </w:t>
-      </w:r>
-      <w:r>
-        <w:rPr>
-          <w:rStyle w:val="VerbatimChar"/>
-        </w:rPr>
-        <w:t xml:space="preserve">results/fairness_{hf,ckd,dm}.md</w:t>
-      </w:r>
-      <w:r>
-        <w:t xml:space="preserve">).</w:t>
+        <w:t xml:space="preserve">Wolff RF, Moons KGM, Riley RD, et al. PROBAST: a tool to assess the risk of bias and</w:t>
+      </w:r>
+      <w:r>
+        <w:t xml:space="preserve"> </w:t>
+      </w:r>
+      <w:r>
+        <w:t xml:space="preserve">applicability of prediction model studies.</w:t>
+      </w:r>
+      <w:r>
+        <w:t xml:space="preserve"> </w:t>
+      </w:r>
+      <w:r>
+        <w:rPr>
+          <w:i/>
+          <w:iCs/>
+        </w:rPr>
+        <w:t xml:space="preserve">Ann Intern Med.</w:t>
+      </w:r>
+      <w:r>
+        <w:t xml:space="preserve"> </w:t>
+      </w:r>
+      <w:r>
+        <w:t xml:space="preserve">2019;170(1):51–58. doi:10.7326/M18-1376</w:t>
       </w:r>
     </w:p>
     <w:p>
@@ -4812,41 +4711,29 @@
         </w:numPr>
       </w:pPr>
       <w:r>
-        <w:rPr>
-          <w:b/>
-          <w:bCs/>
-        </w:rPr>
-        <w:t xml:space="preserve">Figure 1</w:t>
-      </w:r>
-      <w:r>
-        <w:t xml:space="preserve"> </w:t>
-      </w:r>
-      <w:r>
-        <w:t xml:space="preserve">— external validation summary (</w:t>
-      </w:r>
-      <w:r>
-        <w:rPr>
-          <w:rStyle w:val="VerbatimChar"/>
-        </w:rPr>
-        <w:t xml:space="preserve">results/external_validation_summary.png</w:t>
-      </w:r>
-      <w:r>
-        <w:t xml:space="preserve">);</w:t>
-      </w:r>
-      <w:r>
-        <w:t xml:space="preserve"> </w:t>
-      </w:r>
-      <w:r>
-        <w:t xml:space="preserve">per-condition calibration (</w:t>
-      </w:r>
-      <w:r>
-        <w:rPr>
-          <w:rStyle w:val="VerbatimChar"/>
-        </w:rPr>
-        <w:t xml:space="preserve">results/{hf,ckd,dm}_external_calibration.png</w:t>
-      </w:r>
-      <w:r>
-        <w:t xml:space="preserve">).</w:t>
+        <w:t xml:space="preserve">Johnson AEW, Bulgarelli L, Shen L, et al. MIMIC-IV, a freely accessible electronic health record</w:t>
+      </w:r>
+      <w:r>
+        <w:t xml:space="preserve"> </w:t>
+      </w:r>
+      <w:r>
+        <w:t xml:space="preserve">dataset.</w:t>
+      </w:r>
+      <w:r>
+        <w:t xml:space="preserve"> </w:t>
+      </w:r>
+      <w:r>
+        <w:rPr>
+          <w:i/>
+          <w:iCs/>
+        </w:rPr>
+        <w:t xml:space="preserve">Sci Data.</w:t>
+      </w:r>
+      <w:r>
+        <w:t xml:space="preserve"> </w:t>
+      </w:r>
+      <w:r>
+        <w:t xml:space="preserve">2023;10(1):1. doi:10.1038/s41597-022-01899-x</w:t>
       </w:r>
     </w:p>
     <w:p>
@@ -4858,26 +4745,209 @@
         </w:numPr>
       </w:pPr>
       <w:r>
-        <w:rPr>
-          <w:b/>
-          <w:bCs/>
-        </w:rPr>
-        <w:t xml:space="preserve">Figures 2a–c</w:t>
-      </w:r>
-      <w:r>
-        <w:t xml:space="preserve"> </w:t>
-      </w:r>
-      <w:r>
-        <w:t xml:space="preserve">— leakage decay (</w:t>
+        <w:t xml:space="preserve">Pollard TJ, Johnson AEW, Raffa JD, Celi LA, Mark RG, Badawi O. The eICU Collaborative Research</w:t>
+      </w:r>
+      <w:r>
+        <w:t xml:space="preserve"> </w:t>
+      </w:r>
+      <w:r>
+        <w:t xml:space="preserve">Database, a freely available multi-center database for critical care research.</w:t>
+      </w:r>
+      <w:r>
+        <w:t xml:space="preserve"> </w:t>
+      </w:r>
+      <w:r>
+        <w:rPr>
+          <w:i/>
+          <w:iCs/>
+        </w:rPr>
+        <w:t xml:space="preserve">Sci Data.</w:t>
+      </w:r>
+      <w:r>
+        <w:t xml:space="preserve"> </w:t>
+      </w:r>
+      <w:r>
+        <w:t xml:space="preserve">2018;5:180178. doi:10.1038/sdata.2018.178</w:t>
+      </w:r>
+    </w:p>
+    <w:p>
+      <w:pPr>
+        <w:pStyle w:val="FirstParagraph"/>
+      </w:pPr>
+      <w:r>
+        <w:rPr>
+          <w:i/>
+          <w:iCs/>
+        </w:rPr>
+        <w:t xml:space="preserve">Note to authors: references 3–7 are the standard citations for the methods and datasets named in</w:t>
+      </w:r>
+      <w:r>
+        <w:rPr>
+          <w:i/>
+          <w:iCs/>
+        </w:rPr>
+        <w:t xml:space="preserve"> </w:t>
+      </w:r>
+      <w:r>
+        <w:rPr>
+          <w:i/>
+          <w:iCs/>
+        </w:rPr>
+        <w:t xml:space="preserve">the text; please confirm volume/page locators against the publisher record before submission.</w:t>
+      </w:r>
+    </w:p>
+    <w:bookmarkEnd w:id="35"/>
+    <w:bookmarkStart w:id="36" w:name="data-and-code-availability"/>
+    <w:p>
+      <w:pPr>
+        <w:pStyle w:val="Heading2"/>
+      </w:pPr>
+      <w:r>
+        <w:t xml:space="preserve">Data and code availability</w:t>
+      </w:r>
+    </w:p>
+    <w:p>
+      <w:pPr>
+        <w:pStyle w:val="FirstParagraph"/>
+      </w:pPr>
+      <w:r>
+        <w:t xml:space="preserve">MIMIC-IV and eICU-CRD are available to credentialed users on PhysioNet. All cohort SQL</w:t>
+      </w:r>
+      <w:r>
+        <w:t xml:space="preserve"> </w:t>
+      </w:r>
+      <w:r>
+        <w:t xml:space="preserve">(</w:t>
       </w:r>
       <w:r>
         <w:rPr>
           <w:rStyle w:val="VerbatimChar"/>
         </w:rPr>
-        <w:t xml:space="preserve">results/{hf,ckd,dm}_decay.png</w:t>
-      </w:r>
-      <w:r>
-        <w:t xml:space="preserve">).</w:t>
+        <w:t xml:space="preserve">prediction_study/cohort_*.sql</w:t>
+      </w:r>
+      <w:r>
+        <w:t xml:space="preserve">), model and evaluation code (</w:t>
+      </w:r>
+      <w:r>
+        <w:rPr>
+          <w:rStyle w:val="VerbatimChar"/>
+        </w:rPr>
+        <w:t xml:space="preserve">evaluate.py</w:t>
+      </w:r>
+      <w:r>
+        <w:t xml:space="preserve">,</w:t>
+      </w:r>
+      <w:r>
+        <w:t xml:space="preserve"> </w:t>
+      </w:r>
+      <w:r>
+        <w:rPr>
+          <w:rStyle w:val="VerbatimChar"/>
+        </w:rPr>
+        <w:t xml:space="preserve">external_validate.py</w:t>
+      </w:r>
+      <w:r>
+        <w:t xml:space="preserve">,</w:t>
+      </w:r>
+      <w:r>
+        <w:t xml:space="preserve"> </w:t>
+      </w:r>
+      <w:r>
+        <w:rPr>
+          <w:rStyle w:val="VerbatimChar"/>
+        </w:rPr>
+        <w:t xml:space="preserve">identify_eval.py</w:t>
+      </w:r>
+      <w:r>
+        <w:t xml:space="preserve">,</w:t>
+      </w:r>
+      <w:r>
+        <w:t xml:space="preserve"> </w:t>
+      </w:r>
+      <w:r>
+        <w:rPr>
+          <w:rStyle w:val="VerbatimChar"/>
+        </w:rPr>
+        <w:t xml:space="preserve">dca.py</w:t>
+      </w:r>
+      <w:r>
+        <w:t xml:space="preserve">,</w:t>
+      </w:r>
+      <w:r>
+        <w:t xml:space="preserve"> </w:t>
+      </w:r>
+      <w:r>
+        <w:rPr>
+          <w:rStyle w:val="VerbatimChar"/>
+        </w:rPr>
+        <w:t xml:space="preserve">make_decay_figure.py</w:t>
+      </w:r>
+      <w:r>
+        <w:t xml:space="preserve">), the i2b2-ML build driver</w:t>
+      </w:r>
+      <w:r>
+        <w:t xml:space="preserve"> </w:t>
+      </w:r>
+      <w:r>
+        <w:t xml:space="preserve">(</w:t>
+      </w:r>
+      <w:r>
+        <w:rPr>
+          <w:rStyle w:val="VerbatimChar"/>
+        </w:rPr>
+        <w:t xml:space="preserve">pipeline/load_and_build.sh</w:t>
+      </w:r>
+      <w:r>
+        <w:t xml:space="preserve">,</w:t>
+      </w:r>
+      <w:r>
+        <w:t xml:space="preserve"> </w:t>
+      </w:r>
+      <w:r>
+        <w:rPr>
+          <w:rStyle w:val="VerbatimChar"/>
+        </w:rPr>
+        <w:t xml:space="preserve">pipeline/run_ml_build.py</w:t>
+      </w:r>
+      <w:r>
+        <w:t xml:space="preserve">), and all result artifacts and figures</w:t>
+      </w:r>
+      <w:r>
+        <w:t xml:space="preserve"> </w:t>
+      </w:r>
+      <w:r>
+        <w:t xml:space="preserve">(</w:t>
+      </w:r>
+      <w:r>
+        <w:rPr>
+          <w:rStyle w:val="VerbatimChar"/>
+        </w:rPr>
+        <w:t xml:space="preserve">prediction_study/results/</w:t>
+      </w:r>
+      <w:r>
+        <w:t xml:space="preserve">) are released in the project repository under branch</w:t>
+      </w:r>
+      <w:r>
+        <w:t xml:space="preserve"> </w:t>
+      </w:r>
+      <w:r>
+        <w:rPr>
+          <w:rStyle w:val="VerbatimChar"/>
+        </w:rPr>
+        <w:t xml:space="preserve">feature/phenotype-ml-pipeline</w:t>
+      </w:r>
+      <w:r>
+        <w:t xml:space="preserve">.</w:t>
+      </w:r>
+    </w:p>
+    <w:bookmarkEnd w:id="36"/>
+    <w:bookmarkStart w:id="37" w:name="tables-and-figures"/>
+    <w:p>
+      <w:pPr>
+        <w:pStyle w:val="Heading2"/>
+      </w:pPr>
+      <w:r>
+        <w:t xml:space="preserve">Tables and figures</w:t>
       </w:r>
     </w:p>
     <w:p>
@@ -4885,7 +4955,7 @@
         <w:pStyle w:val="Compact"/>
         <w:numPr>
           <w:ilvl w:val="0"/>
-          <w:numId w:val="1003"/>
+          <w:numId w:val="1004"/>
         </w:numPr>
       </w:pPr>
       <w:r>
@@ -4893,47 +4963,10 @@
           <w:b/>
           <w:bCs/>
         </w:rPr>
-        <w:t xml:space="preserve">Figures 3a–c</w:t>
-      </w:r>
-      <w:r>
-        <w:t xml:space="preserve"> </w:t>
-      </w:r>
-      <w:r>
-        <w:t xml:space="preserve">— decision curves (</w:t>
-      </w:r>
-      <w:r>
-        <w:rPr>
-          <w:rStyle w:val="VerbatimChar"/>
-        </w:rPr>
-        <w:t xml:space="preserve">results/{hf,ckd,dm}_dca.png</w:t>
-      </w:r>
-      <w:r>
-        <w:t xml:space="preserve">);</w:t>
-      </w:r>
-      <w:r>
-        <w:t xml:space="preserve"> </w:t>
-      </w:r>
-      <w:r>
-        <w:rPr>
-          <w:b/>
-          <w:bCs/>
-        </w:rPr>
-        <w:t xml:space="preserve">Figure 3d</w:t>
-      </w:r>
-      <w:r>
-        <w:t xml:space="preserve"> </w:t>
-      </w:r>
-      <w:r>
-        <w:t xml:space="preserve">— full vs guideline-variable reference comparator (</w:t>
-      </w:r>
-      <w:r>
-        <w:rPr>
-          <w:rStyle w:val="VerbatimChar"/>
-        </w:rPr>
-        <w:t xml:space="preserve">results/hf_reference_dca.png</w:t>
-      </w:r>
-      <w:r>
-        <w:t xml:space="preserve">).</w:t>
+        <w:t xml:space="preserve">Table 1</w:t>
+      </w:r>
+      <w:r>
+        <w:t xml:space="preserve">: internal discrimination/calibration (§3.2).</w:t>
       </w:r>
     </w:p>
     <w:p>
@@ -4941,7 +4974,7 @@
         <w:pStyle w:val="Compact"/>
         <w:numPr>
           <w:ilvl w:val="0"/>
-          <w:numId w:val="1003"/>
+          <w:numId w:val="1004"/>
         </w:numPr>
       </w:pPr>
       <w:r>
@@ -4949,13 +4982,255 @@
           <w:b/>
           <w:bCs/>
         </w:rPr>
+        <w:t xml:space="preserve">Table 2</w:t>
+      </w:r>
+      <w:r>
+        <w:t xml:space="preserve">: internal vs external + recalibration (</w:t>
+      </w:r>
+      <w:r>
+        <w:rPr>
+          <w:rStyle w:val="VerbatimChar"/>
+        </w:rPr>
+        <w:t xml:space="preserve">results/external_validation_summary.md</w:t>
+      </w:r>
+      <w:r>
+        <w:t xml:space="preserve">).</w:t>
+      </w:r>
+    </w:p>
+    <w:p>
+      <w:pPr>
+        <w:pStyle w:val="Compact"/>
+        <w:numPr>
+          <w:ilvl w:val="0"/>
+          <w:numId w:val="1004"/>
+        </w:numPr>
+      </w:pPr>
+      <w:r>
+        <w:rPr>
+          <w:b/>
+          <w:bCs/>
+        </w:rPr>
+        <w:t xml:space="preserve">Table 3</w:t>
+      </w:r>
+      <w:r>
+        <w:t xml:space="preserve">: leakage-decay (</w:t>
+      </w:r>
+      <w:r>
+        <w:rPr>
+          <w:rStyle w:val="VerbatimChar"/>
+        </w:rPr>
+        <w:t xml:space="preserve">results/{hf,ckd,dm}_decay_table.md</w:t>
+      </w:r>
+      <w:r>
+        <w:t xml:space="preserve">).</w:t>
+      </w:r>
+    </w:p>
+    <w:p>
+      <w:pPr>
+        <w:pStyle w:val="Compact"/>
+        <w:numPr>
+          <w:ilvl w:val="0"/>
+          <w:numId w:val="1004"/>
+        </w:numPr>
+      </w:pPr>
+      <w:r>
+        <w:rPr>
+          <w:b/>
+          <w:bCs/>
+        </w:rPr>
+        <w:t xml:space="preserve">Table 4</w:t>
+      </w:r>
+      <w:r>
+        <w:t xml:space="preserve">: tool vs harness (</w:t>
+      </w:r>
+      <w:r>
+        <w:rPr>
+          <w:rStyle w:val="VerbatimChar"/>
+        </w:rPr>
+        <w:t xml:space="preserve">results/tool_capability_map.md</w:t>
+      </w:r>
+      <w:r>
+        <w:t xml:space="preserve">).</w:t>
+      </w:r>
+    </w:p>
+    <w:p>
+      <w:pPr>
+        <w:pStyle w:val="Compact"/>
+        <w:numPr>
+          <w:ilvl w:val="0"/>
+          <w:numId w:val="1004"/>
+        </w:numPr>
+      </w:pPr>
+      <w:r>
+        <w:rPr>
+          <w:b/>
+          <w:bCs/>
+        </w:rPr>
+        <w:t xml:space="preserve">Table 5</w:t>
+      </w:r>
+      <w:r>
+        <w:t xml:space="preserve">: subgroup performance by sex and age (</w:t>
+      </w:r>
+      <w:r>
+        <w:rPr>
+          <w:rStyle w:val="VerbatimChar"/>
+        </w:rPr>
+        <w:t xml:space="preserve">results/model_audit_summary.md</w:t>
+      </w:r>
+      <w:r>
+        <w:t xml:space="preserve">,</w:t>
+      </w:r>
+      <w:r>
+        <w:t xml:space="preserve"> </w:t>
+      </w:r>
+      <w:r>
+        <w:rPr>
+          <w:rStyle w:val="VerbatimChar"/>
+        </w:rPr>
+        <w:t xml:space="preserve">results/fairness_{hf,ckd,dm}.md</w:t>
+      </w:r>
+      <w:r>
+        <w:t xml:space="preserve">).</w:t>
+      </w:r>
+    </w:p>
+    <w:p>
+      <w:pPr>
+        <w:pStyle w:val="Compact"/>
+        <w:numPr>
+          <w:ilvl w:val="0"/>
+          <w:numId w:val="1004"/>
+        </w:numPr>
+      </w:pPr>
+      <w:r>
+        <w:rPr>
+          <w:b/>
+          <w:bCs/>
+        </w:rPr>
+        <w:t xml:space="preserve">Figure 1</w:t>
+      </w:r>
+      <w:r>
+        <w:t xml:space="preserve">: external validation summary (</w:t>
+      </w:r>
+      <w:r>
+        <w:rPr>
+          <w:rStyle w:val="VerbatimChar"/>
+        </w:rPr>
+        <w:t xml:space="preserve">results/external_validation_summary.png</w:t>
+      </w:r>
+      <w:r>
+        <w:t xml:space="preserve">);</w:t>
+      </w:r>
+      <w:r>
+        <w:t xml:space="preserve"> </w:t>
+      </w:r>
+      <w:r>
+        <w:t xml:space="preserve">per-condition calibration (</w:t>
+      </w:r>
+      <w:r>
+        <w:rPr>
+          <w:rStyle w:val="VerbatimChar"/>
+        </w:rPr>
+        <w:t xml:space="preserve">results/{hf,ckd,dm}_external_calibration.png</w:t>
+      </w:r>
+      <w:r>
+        <w:t xml:space="preserve">).</w:t>
+      </w:r>
+    </w:p>
+    <w:p>
+      <w:pPr>
+        <w:pStyle w:val="Compact"/>
+        <w:numPr>
+          <w:ilvl w:val="0"/>
+          <w:numId w:val="1004"/>
+        </w:numPr>
+      </w:pPr>
+      <w:r>
+        <w:rPr>
+          <w:b/>
+          <w:bCs/>
+        </w:rPr>
+        <w:t xml:space="preserve">Figures 2a–c</w:t>
+      </w:r>
+      <w:r>
+        <w:t xml:space="preserve">: leakage decay (</w:t>
+      </w:r>
+      <w:r>
+        <w:rPr>
+          <w:rStyle w:val="VerbatimChar"/>
+        </w:rPr>
+        <w:t xml:space="preserve">results/{hf,ckd,dm}_decay.png</w:t>
+      </w:r>
+      <w:r>
+        <w:t xml:space="preserve">).</w:t>
+      </w:r>
+    </w:p>
+    <w:p>
+      <w:pPr>
+        <w:pStyle w:val="Compact"/>
+        <w:numPr>
+          <w:ilvl w:val="0"/>
+          <w:numId w:val="1004"/>
+        </w:numPr>
+      </w:pPr>
+      <w:r>
+        <w:rPr>
+          <w:b/>
+          <w:bCs/>
+        </w:rPr>
+        <w:t xml:space="preserve">Figures 3a–c</w:t>
+      </w:r>
+      <w:r>
+        <w:t xml:space="preserve">: decision curves (</w:t>
+      </w:r>
+      <w:r>
+        <w:rPr>
+          <w:rStyle w:val="VerbatimChar"/>
+        </w:rPr>
+        <w:t xml:space="preserve">results/{hf,ckd,dm}_dca.png</w:t>
+      </w:r>
+      <w:r>
+        <w:t xml:space="preserve">);</w:t>
+      </w:r>
+      <w:r>
+        <w:t xml:space="preserve"> </w:t>
+      </w:r>
+      <w:r>
+        <w:rPr>
+          <w:b/>
+          <w:bCs/>
+        </w:rPr>
+        <w:t xml:space="preserve">Figure 3d</w:t>
+      </w:r>
+      <w:r>
+        <w:t xml:space="preserve">: full vs guideline-variable reference comparator (</w:t>
+      </w:r>
+      <w:r>
+        <w:rPr>
+          <w:rStyle w:val="VerbatimChar"/>
+        </w:rPr>
+        <w:t xml:space="preserve">results/hf_reference_dca.png</w:t>
+      </w:r>
+      <w:r>
+        <w:t xml:space="preserve">).</w:t>
+      </w:r>
+    </w:p>
+    <w:p>
+      <w:pPr>
+        <w:pStyle w:val="Compact"/>
+        <w:numPr>
+          <w:ilvl w:val="0"/>
+          <w:numId w:val="1004"/>
+        </w:numPr>
+      </w:pPr>
+      <w:r>
+        <w:rPr>
+          <w:b/>
+          <w:bCs/>
+        </w:rPr>
         <w:t xml:space="preserve">Supplement</w:t>
       </w:r>
       <w:r>
-        <w:t xml:space="preserve"> </w:t>
-      </w:r>
-      <w:r>
-        <w:t xml:space="preserve">— TRIPOD+AI checklist (</w:t>
+        <w:t xml:space="preserve">: TRIPOD+AI checklist (</w:t>
       </w:r>
       <w:r>
         <w:rPr>
@@ -5006,7 +5281,7 @@
         <w:t xml:space="preserve">).</w:t>
       </w:r>
     </w:p>
-    <w:bookmarkEnd w:id="36"/>
+    <w:bookmarkEnd w:id="37"/>
     <w:sectPr>
       <w:footnotePr>
         <w:numRestart w:val="eachSect"/>
@@ -5342,6 +5617,36 @@
     </w:lvlOverride>
   </w:num>
   <w:num w:numId="1003">
+    <w:abstractNumId w:val="99411"/>
+    <w:lvlOverride w:ilvl="0">
+      <w:startOverride w:val="1"/>
+    </w:lvlOverride>
+    <w:lvlOverride w:ilvl="1">
+      <w:startOverride w:val="1"/>
+    </w:lvlOverride>
+    <w:lvlOverride w:ilvl="2">
+      <w:startOverride w:val="1"/>
+    </w:lvlOverride>
+    <w:lvlOverride w:ilvl="3">
+      <w:startOverride w:val="1"/>
+    </w:lvlOverride>
+    <w:lvlOverride w:ilvl="4">
+      <w:startOverride w:val="1"/>
+    </w:lvlOverride>
+    <w:lvlOverride w:ilvl="5">
+      <w:startOverride w:val="1"/>
+    </w:lvlOverride>
+    <w:lvlOverride w:ilvl="6">
+      <w:startOverride w:val="1"/>
+    </w:lvlOverride>
+    <w:lvlOverride w:ilvl="7">
+      <w:startOverride w:val="1"/>
+    </w:lvlOverride>
+    <w:lvlOverride w:ilvl="8">
+      <w:startOverride w:val="1"/>
+    </w:lvlOverride>
+  </w:num>
+  <w:num w:numId="1004">
     <w:abstractNumId w:val="991"/>
   </w:num>
 </w:numbering>

</xml_diff>